<commit_message>
Workbook prep for fall 26 term
</commit_message>
<xml_diff>
--- a/workbook/00 workbook/workbookHome.docx
+++ b/workbook/00 workbook/workbookHome.docx
@@ -84,7 +84,7 @@
           <w:noProof/>
         </w:rPr>
         <w:drawing>
-          <wp:inline distT="0" distB="0" distL="0" distR="0" wp14:anchorId="6CE019FA" wp14:editId="6C5183DA">
+          <wp:inline distT="0" distB="0" distL="0" distR="0" wp14:anchorId="3947320C" wp14:editId="7B57BF69">
             <wp:extent cx="5937885" cy="4595495"/>
             <wp:effectExtent l="0" t="0" r="5715" b="0"/>
             <wp:docPr id="2139680190" name="Picture 1"/>
@@ -138,23 +138,18 @@
         <w:spacing w:after="160" w:line="259" w:lineRule="auto"/>
         <w:ind w:left="0" w:firstLine="0"/>
         <w:rPr>
-          <w:rFonts w:asciiTheme="minorHAnsi" w:hAnsiTheme="minorHAnsi" w:cstheme="minorHAnsi"/>
+          <w:b/>
+          <w:sz w:val="36"/>
+          <w:szCs w:val="36"/>
         </w:rPr>
       </w:pPr>
       <w:r>
         <w:rPr>
-          <w:rFonts w:asciiTheme="minorHAnsi" w:hAnsiTheme="minorHAnsi" w:cstheme="minorHAnsi"/>
+          <w:sz w:val="36"/>
+          <w:szCs w:val="36"/>
         </w:rPr>
         <w:br w:type="page"/>
       </w:r>
-    </w:p>
-    <w:p>
-      <w:pPr>
-        <w:ind w:left="0" w:firstLine="0"/>
-        <w:rPr>
-          <w:rFonts w:asciiTheme="minorHAnsi" w:hAnsiTheme="minorHAnsi" w:cstheme="minorHAnsi"/>
-        </w:rPr>
-      </w:pPr>
     </w:p>
     <w:p>
       <w:pPr>
@@ -203,16 +198,6 @@
         </w:rPr>
       </w:pPr>
       <w:subDoc r:id="rId13"/>
-    </w:p>
-    <w:p>
-      <w:pPr>
-        <w:spacing w:after="160" w:line="259" w:lineRule="auto"/>
-        <w:ind w:left="0" w:firstLine="0"/>
-        <w:rPr>
-          <w:sz w:val="36"/>
-          <w:szCs w:val="36"/>
-        </w:rPr>
-      </w:pPr>
       <w:r>
         <w:rPr>
           <w:sz w:val="36"/>
@@ -344,12 +329,6 @@
           <w:szCs w:val="36"/>
         </w:rPr>
         <w:tab/>
-      </w:r>
-      <w:r>
-        <w:rPr>
-          <w:sz w:val="36"/>
-          <w:szCs w:val="36"/>
-        </w:rPr>
         <w:t>Diode</w:t>
       </w:r>
     </w:p>
@@ -414,14 +393,25 @@
           <w:szCs w:val="36"/>
         </w:rPr>
         <w:tab/>
+        <w:t>BJT DC</w:t>
       </w:r>
-      <w:r>
-        <w:rPr>
-          <w:sz w:val="36"/>
-          <w:szCs w:val="36"/>
-        </w:rPr>
-        <w:t>BJT @ DC</w:t>
-      </w:r>
+    </w:p>
+    <w:p>
+      <w:pPr>
+        <w:sectPr>
+          <w:headerReference w:type="even" r:id="rId28"/>
+          <w:headerReference w:type="default" r:id="rId29"/>
+          <w:footerReference w:type="even" r:id="rId30"/>
+          <w:footerReference w:type="default" r:id="rId31"/>
+          <w:headerReference w:type="first" r:id="rId32"/>
+          <w:footerReference w:type="first" r:id="rId33"/>
+          <w:type w:val="continuous"/>
+          <w:pgSz w:w="12240" w:h="15840"/>
+          <w:pgMar w:top="1509" w:right="1436" w:bottom="1480" w:left="1440" w:header="720" w:footer="719" w:gutter="0"/>
+          <w:cols w:space="720"/>
+          <w:titlePg/>
+        </w:sectPr>
+      </w:pPr>
     </w:p>
     <w:p>
       <w:pPr>
@@ -432,7 +422,7 @@
           <w:szCs w:val="36"/>
         </w:rPr>
       </w:pPr>
-      <w:subDoc r:id="rId28"/>
+      <w:subDoc r:id="rId34"/>
       <w:r>
         <w:rPr>
           <w:sz w:val="36"/>
@@ -450,12 +440,12 @@
           <w:szCs w:val="36"/>
         </w:rPr>
         <w:sectPr>
-          <w:headerReference w:type="even" r:id="rId29"/>
-          <w:headerReference w:type="default" r:id="rId30"/>
-          <w:footerReference w:type="even" r:id="rId31"/>
-          <w:footerReference w:type="default" r:id="rId32"/>
-          <w:headerReference w:type="first" r:id="rId33"/>
-          <w:footerReference w:type="first" r:id="rId34"/>
+          <w:headerReference w:type="even" r:id="rId35"/>
+          <w:headerReference w:type="default" r:id="rId36"/>
+          <w:footerReference w:type="even" r:id="rId37"/>
+          <w:footerReference w:type="default" r:id="rId38"/>
+          <w:headerReference w:type="first" r:id="rId39"/>
+          <w:footerReference w:type="first" r:id="rId40"/>
           <w:type w:val="continuous"/>
           <w:pgSz w:w="12240" w:h="15840"/>
           <w:pgMar w:top="1509" w:right="1436" w:bottom="1480" w:left="1440" w:header="720" w:footer="719" w:gutter="0"/>
@@ -477,14 +467,7 @@
           <w:sz w:val="36"/>
           <w:szCs w:val="36"/>
         </w:rPr>
-        <w:t>Chapter</w:t>
-      </w:r>
-      <w:r>
-        <w:rPr>
-          <w:sz w:val="36"/>
-          <w:szCs w:val="36"/>
-        </w:rPr>
-        <w:t>:</w:t>
+        <w:t>Chapter:</w:t>
       </w:r>
       <w:r>
         <w:rPr>
@@ -499,7 +482,7 @@
           <w:szCs w:val="36"/>
         </w:rPr>
         <w:tab/>
-        <w:t>BJT @ AC</w:t>
+        <w:t>BJT AC</w:t>
       </w:r>
     </w:p>
     <w:p>
@@ -511,64 +494,7 @@
           <w:szCs w:val="36"/>
         </w:rPr>
       </w:pPr>
-      <w:subDoc r:id="rId35"/>
-      <w:r>
-        <w:rPr>
-          <w:rFonts w:cstheme="minorHAnsi"/>
-          <w:noProof/>
-        </w:rPr>
-        <w:drawing>
-          <wp:inline distT="0" distB="0" distL="0" distR="0" wp14:anchorId="0E3C421A" wp14:editId="38C09552">
-            <wp:extent cx="3600096" cy="2880000"/>
-            <wp:effectExtent l="0" t="0" r="635" b="0"/>
-            <wp:docPr id="1792045625" name="Picture 8"/>
-            <wp:cNvGraphicFramePr>
-              <a:graphicFrameLocks xmlns:a="http://schemas.openxmlformats.org/drawingml/2006/main" noChangeAspect="1"/>
-            </wp:cNvGraphicFramePr>
-            <a:graphic xmlns:a="http://schemas.openxmlformats.org/drawingml/2006/main">
-              <a:graphicData uri="http://schemas.openxmlformats.org/drawingml/2006/picture">
-                <pic:pic xmlns:pic="http://schemas.openxmlformats.org/drawingml/2006/picture">
-                  <pic:nvPicPr>
-                    <pic:cNvPr id="1622644604" name="Picture 1622644604"/>
-                    <pic:cNvPicPr/>
-                  </pic:nvPicPr>
-                  <pic:blipFill>
-                    <a:blip r:embed="rId36" cstate="print">
-                      <a:extLst>
-                        <a:ext uri="{28A0092B-C50C-407E-A947-70E740481C1C}">
-                          <a14:useLocalDpi xmlns:a14="http://schemas.microsoft.com/office/drawing/2010/main" val="0"/>
-                        </a:ext>
-                      </a:extLst>
-                    </a:blip>
-                    <a:stretch>
-                      <a:fillRect/>
-                    </a:stretch>
-                  </pic:blipFill>
-                  <pic:spPr>
-                    <a:xfrm>
-                      <a:off x="0" y="0"/>
-                      <a:ext cx="3600096" cy="2880000"/>
-                    </a:xfrm>
-                    <a:prstGeom prst="rect">
-                      <a:avLst/>
-                    </a:prstGeom>
-                  </pic:spPr>
-                </pic:pic>
-              </a:graphicData>
-            </a:graphic>
-          </wp:inline>
-        </w:drawing>
-      </w:r>
-    </w:p>
-    <w:p>
-      <w:pPr>
-        <w:spacing w:after="160" w:line="259" w:lineRule="auto"/>
-        <w:ind w:left="0" w:firstLine="0"/>
-        <w:rPr>
-          <w:sz w:val="36"/>
-          <w:szCs w:val="36"/>
-        </w:rPr>
-      </w:pPr>
+      <w:subDoc r:id="rId41"/>
       <w:r>
         <w:rPr>
           <w:sz w:val="36"/>
@@ -586,12 +512,12 @@
           <w:szCs w:val="36"/>
         </w:rPr>
         <w:sectPr>
-          <w:headerReference w:type="even" r:id="rId37"/>
-          <w:headerReference w:type="default" r:id="rId38"/>
-          <w:footerReference w:type="even" r:id="rId39"/>
-          <w:footerReference w:type="default" r:id="rId40"/>
-          <w:headerReference w:type="first" r:id="rId41"/>
-          <w:footerReference w:type="first" r:id="rId42"/>
+          <w:headerReference w:type="even" r:id="rId42"/>
+          <w:headerReference w:type="default" r:id="rId43"/>
+          <w:footerReference w:type="even" r:id="rId44"/>
+          <w:footerReference w:type="default" r:id="rId45"/>
+          <w:headerReference w:type="first" r:id="rId46"/>
+          <w:footerReference w:type="first" r:id="rId47"/>
           <w:type w:val="continuous"/>
           <w:pgSz w:w="12240" w:h="15840"/>
           <w:pgMar w:top="1509" w:right="1436" w:bottom="1480" w:left="1440" w:header="720" w:footer="719" w:gutter="0"/>
@@ -633,104 +559,10 @@
     </w:p>
     <w:p>
       <w:pPr>
-        <w:ind w:left="0" w:firstLine="0"/>
-      </w:pPr>
-      <w:subDoc r:id="rId43"/>
-      <w:r>
-        <w:rPr>
-          <w:noProof/>
-        </w:rPr>
-        <mc:AlternateContent>
-          <mc:Choice Requires="wps">
-            <w:drawing>
-              <wp:anchor distT="45720" distB="45720" distL="114300" distR="114300" simplePos="0" relativeHeight="251773952" behindDoc="0" locked="0" layoutInCell="1" allowOverlap="1" wp14:anchorId="4F2D3544" wp14:editId="146160AD">
-                <wp:simplePos x="0" y="0"/>
-                <wp:positionH relativeFrom="column">
-                  <wp:posOffset>50800</wp:posOffset>
-                </wp:positionH>
-                <wp:positionV relativeFrom="paragraph">
-                  <wp:posOffset>626110</wp:posOffset>
-                </wp:positionV>
-                <wp:extent cx="5399405" cy="2880000"/>
-                <wp:effectExtent l="0" t="0" r="10795" b="15875"/>
-                <wp:wrapSquare wrapText="bothSides"/>
-                <wp:docPr id="91227864" name="Text Box 2"/>
-                <wp:cNvGraphicFramePr>
-                  <a:graphicFrameLocks xmlns:a="http://schemas.openxmlformats.org/drawingml/2006/main"/>
-                </wp:cNvGraphicFramePr>
-                <a:graphic xmlns:a="http://schemas.openxmlformats.org/drawingml/2006/main">
-                  <a:graphicData uri="http://schemas.microsoft.com/office/word/2010/wordprocessingShape">
-                    <wps:wsp>
-                      <wps:cNvSpPr txBox="1">
-                        <a:spLocks noChangeArrowheads="1"/>
-                      </wps:cNvSpPr>
-                      <wps:spPr bwMode="auto">
-                        <a:xfrm>
-                          <a:off x="0" y="0"/>
-                          <a:ext cx="5399405" cy="2880000"/>
-                        </a:xfrm>
-                        <a:prstGeom prst="rect">
-                          <a:avLst/>
-                        </a:prstGeom>
-                        <a:solidFill>
-                          <a:srgbClr val="FFFFFF"/>
-                        </a:solidFill>
-                        <a:ln w="9525">
-                          <a:solidFill>
-                            <a:srgbClr val="000000"/>
-                          </a:solidFill>
-                          <a:miter lim="800000"/>
-                          <a:headEnd/>
-                          <a:tailEnd/>
-                        </a:ln>
-                      </wps:spPr>
-                      <wps:txbx>
-                        <w:txbxContent>
-                          <w:p/>
-                        </w:txbxContent>
-                      </wps:txbx>
-                      <wps:bodyPr rot="0" vert="horz" wrap="square" lIns="91440" tIns="45720" rIns="91440" bIns="45720" anchor="t" anchorCtr="0">
-                        <a:noAutofit/>
-                      </wps:bodyPr>
-                    </wps:wsp>
-                  </a:graphicData>
-                </a:graphic>
-                <wp14:sizeRelH relativeFrom="margin">
-                  <wp14:pctWidth>0</wp14:pctWidth>
-                </wp14:sizeRelH>
-                <wp14:sizeRelV relativeFrom="margin">
-                  <wp14:pctHeight>0</wp14:pctHeight>
-                </wp14:sizeRelV>
-              </wp:anchor>
-            </w:drawing>
-          </mc:Choice>
-          <mc:Fallback>
-            <w:pict>
-              <v:shapetype w14:anchorId="4F2D3544" id="_x0000_t202" coordsize="21600,21600" o:spt="202" path="m,l,21600r21600,l21600,xe">
-                <v:stroke joinstyle="miter"/>
-                <v:path gradientshapeok="t" o:connecttype="rect"/>
-              </v:shapetype>
-              <v:shape id="Text Box 2" o:spid="_x0000_s1026" type="#_x0000_t202" style="position:absolute;margin-left:4pt;margin-top:49.3pt;width:425.15pt;height:226.75pt;z-index:251773952;visibility:visible;mso-wrap-style:square;mso-width-percent:0;mso-height-percent:0;mso-wrap-distance-left:9pt;mso-wrap-distance-top:3.6pt;mso-wrap-distance-right:9pt;mso-wrap-distance-bottom:3.6pt;mso-position-horizontal:absolute;mso-position-horizontal-relative:text;mso-position-vertical:absolute;mso-position-vertical-relative:text;mso-width-percent:0;mso-height-percent:0;mso-width-relative:margin;mso-height-relative:margin;v-text-anchor:top" o:gfxdata="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">
-                <v:textbox>
-                  <w:txbxContent>
-                    <w:p/>
-                  </w:txbxContent>
-                </v:textbox>
-                <w10:wrap type="square"/>
-              </v:shape>
-            </w:pict>
-          </mc:Fallback>
-        </mc:AlternateContent>
-      </w:r>
-      <w:r>
-        <w:t>Why does this filter output the average value of a 10kHz PWM waveform?  Hint, construct the Fourier series of the 10kHz PWM wave, then consider which harmonics the filter passes and which it blocks.</w:t>
-      </w:r>
-    </w:p>
-    <w:p>
-      <w:pPr>
         <w:spacing w:after="160" w:line="259" w:lineRule="auto"/>
         <w:ind w:left="0" w:firstLine="0"/>
       </w:pPr>
+      <w:subDoc r:id="rId48"/>
       <w:r>
         <w:br w:type="page"/>
       </w:r>
@@ -743,12 +575,12 @@
           <w:szCs w:val="36"/>
         </w:rPr>
         <w:sectPr>
-          <w:headerReference w:type="even" r:id="rId44"/>
-          <w:headerReference w:type="default" r:id="rId45"/>
-          <w:footerReference w:type="even" r:id="rId46"/>
-          <w:footerReference w:type="default" r:id="rId47"/>
-          <w:headerReference w:type="first" r:id="rId48"/>
-          <w:footerReference w:type="first" r:id="rId49"/>
+          <w:headerReference w:type="even" r:id="rId49"/>
+          <w:headerReference w:type="default" r:id="rId50"/>
+          <w:footerReference w:type="even" r:id="rId51"/>
+          <w:footerReference w:type="default" r:id="rId52"/>
+          <w:headerReference w:type="first" r:id="rId53"/>
+          <w:footerReference w:type="first" r:id="rId54"/>
           <w:type w:val="continuous"/>
           <w:pgSz w:w="12240" w:h="15840"/>
           <w:pgMar w:top="1509" w:right="1436" w:bottom="1480" w:left="1440" w:header="720" w:footer="719" w:gutter="0"/>
@@ -791,15 +623,15 @@
       <w:pPr>
         <w:ind w:left="0" w:firstLine="0"/>
       </w:pPr>
-      <w:subDoc r:id="rId50"/>
+      <w:subDoc r:id="rId55"/>
     </w:p>
     <w:sectPr>
-      <w:headerReference w:type="even" r:id="rId51"/>
-      <w:headerReference w:type="default" r:id="rId52"/>
-      <w:footerReference w:type="even" r:id="rId53"/>
-      <w:footerReference w:type="default" r:id="rId54"/>
-      <w:headerReference w:type="first" r:id="rId55"/>
-      <w:footerReference w:type="first" r:id="rId56"/>
+      <w:headerReference w:type="even" r:id="rId56"/>
+      <w:headerReference w:type="default" r:id="rId57"/>
+      <w:footerReference w:type="even" r:id="rId58"/>
+      <w:footerReference w:type="default" r:id="rId59"/>
+      <w:headerReference w:type="first" r:id="rId60"/>
+      <w:footerReference w:type="first" r:id="rId61"/>
       <w:type w:val="continuous"/>
       <w:pgSz w:w="12240" w:h="15840"/>
       <w:pgMar w:top="1509" w:right="1436" w:bottom="1480" w:left="1440" w:header="720" w:footer="719" w:gutter="0"/>
@@ -1217,18 +1049,6 @@
       <w:t xml:space="preserve"> </w:t>
     </w:r>
   </w:p>
-  <w:p>
-    <w:pPr>
-      <w:spacing w:after="0" w:line="259" w:lineRule="auto"/>
-      <w:ind w:left="0" w:firstLine="0"/>
-    </w:pPr>
-    <w:r>
-      <w:rPr>
-        <w:rFonts w:ascii="Calibri" w:eastAsia="Calibri" w:hAnsi="Calibri" w:cs="Calibri"/>
-      </w:rPr>
-      <w:t xml:space="preserve"> </w:t>
-    </w:r>
-  </w:p>
 </w:ftr>
 </file>
 
@@ -1241,6 +1061,9 @@
       <w:jc w:val="right"/>
     </w:pPr>
     <w:r>
+      <w:t xml:space="preserve"> page </w:t>
+    </w:r>
+    <w:r>
       <w:fldChar w:fldCharType="begin"/>
     </w:r>
     <w:r>
@@ -1265,18 +1088,6 @@
     <w:r>
       <w:rPr>
         <w:rFonts w:eastAsia="Calibri" w:cs="Calibri"/>
-      </w:rPr>
-      <w:t xml:space="preserve"> </w:t>
-    </w:r>
-  </w:p>
-  <w:p>
-    <w:pPr>
-      <w:spacing w:after="0" w:line="259" w:lineRule="auto"/>
-      <w:ind w:left="0" w:firstLine="0"/>
-    </w:pPr>
-    <w:r>
-      <w:rPr>
-        <w:rFonts w:ascii="Calibri" w:eastAsia="Calibri" w:hAnsi="Calibri" w:cs="Calibri"/>
       </w:rPr>
       <w:t xml:space="preserve"> </w:t>
     </w:r>
@@ -1491,6 +1302,161 @@
 </w:ftr>
 </file>
 
+<file path=word/footer22.xml><?xml version="1.0" encoding="utf-8"?>
+<w:ftr xmlns:wpc="http://schemas.microsoft.com/office/word/2010/wordprocessingCanvas" xmlns:cx="http://schemas.microsoft.com/office/drawing/2014/chartex" xmlns:cx1="http://schemas.microsoft.com/office/drawing/2015/9/8/chartex" xmlns:cx2="http://schemas.microsoft.com/office/drawing/2015/10/21/chartex" xmlns:cx3="http://schemas.microsoft.com/office/drawing/2016/5/9/chartex" xmlns:cx4="http://schemas.microsoft.com/office/drawing/2016/5/10/chartex" xmlns:cx5="http://schemas.microsoft.com/office/drawing/2016/5/11/chartex" xmlns:cx6="http://schemas.microsoft.com/office/drawing/2016/5/12/chartex" xmlns:cx7="http://schemas.microsoft.com/office/drawing/2016/5/13/chartex" xmlns:cx8="http://schemas.microsoft.com/office/drawing/2016/5/14/chartex" xmlns:mc="http://schemas.openxmlformats.org/markup-compatibility/2006" xmlns:aink="http://schemas.microsoft.com/office/drawing/2016/ink" xmlns:am3d="http://schemas.microsoft.com/office/drawing/2017/model3d" xmlns:o="urn:schemas-microsoft-com:office:office" xmlns:oel="http://schemas.microsoft.com/office/2019/extlst" xmlns:r="http://schemas.openxmlformats.org/officeDocument/2006/relationships" xmlns:m="http://schemas.openxmlformats.org/officeDocument/2006/math" xmlns:v="urn:schemas-microsoft-com:vml" xmlns:wp14="http://schemas.microsoft.com/office/word/2010/wordprocessingDrawing" xmlns:wp="http://schemas.openxmlformats.org/drawingml/2006/wordprocessingDrawing" xmlns:w10="urn:schemas-microsoft-com:office:word" xmlns:w="http://schemas.openxmlformats.org/wordprocessingml/2006/main" xmlns:w14="http://schemas.microsoft.com/office/word/2010/wordml" xmlns:w15="http://schemas.microsoft.com/office/word/2012/wordml" xmlns:w16cei="http://schemas.microsoft.com/office/word/2026/wordml/cei" xmlns:w16cex="http://schemas.microsoft.com/office/word/2018/wordml/cex" xmlns:w16cid="http://schemas.microsoft.com/office/word/2016/wordml/cid" xmlns:w16="http://schemas.microsoft.com/office/word/2018/wordml" xmlns:w16du="http://schemas.microsoft.com/office/word/2023/wordml/word16du" xmlns:w16sdtdh="http://schemas.microsoft.com/office/word/2020/wordml/sdtdatahash" xmlns:w16sdtfl="http://schemas.microsoft.com/office/word/2024/wordml/sdtformatlock" xmlns:w16se="http://schemas.microsoft.com/office/word/2015/wordml/symex" xmlns:wpg="http://schemas.microsoft.com/office/word/2010/wordprocessingGroup" xmlns:wpi="http://schemas.microsoft.com/office/word/2010/wordprocessingInk" xmlns:wne="http://schemas.microsoft.com/office/word/2006/wordml" xmlns:wps="http://schemas.microsoft.com/office/word/2010/wordprocessingShape" mc:Ignorable="w14 w15 w16se w16cid w16 w16cex w16sdtdh w16sdtfl w16du wp14">
+  <w:p>
+    <w:pPr>
+      <w:spacing w:after="0" w:line="259" w:lineRule="auto"/>
+      <w:ind w:left="0" w:right="1" w:firstLine="0"/>
+      <w:jc w:val="right"/>
+    </w:pPr>
+    <w:r>
+      <w:fldChar w:fldCharType="begin"/>
+    </w:r>
+    <w:r>
+      <w:instrText xml:space="preserve"> PAGE   \* MERGEFORMAT </w:instrText>
+    </w:r>
+    <w:r>
+      <w:fldChar w:fldCharType="separate"/>
+    </w:r>
+    <w:r>
+      <w:rPr>
+        <w:rFonts w:ascii="Calibri" w:eastAsia="Calibri" w:hAnsi="Calibri" w:cs="Calibri"/>
+      </w:rPr>
+      <w:t>1</w:t>
+    </w:r>
+    <w:r>
+      <w:rPr>
+        <w:rFonts w:ascii="Calibri" w:eastAsia="Calibri" w:hAnsi="Calibri" w:cs="Calibri"/>
+      </w:rPr>
+      <w:fldChar w:fldCharType="end"/>
+    </w:r>
+    <w:r>
+      <w:rPr>
+        <w:rFonts w:ascii="Calibri" w:eastAsia="Calibri" w:hAnsi="Calibri" w:cs="Calibri"/>
+      </w:rPr>
+      <w:t xml:space="preserve"> </w:t>
+    </w:r>
+  </w:p>
+  <w:p>
+    <w:pPr>
+      <w:spacing w:after="0" w:line="259" w:lineRule="auto"/>
+      <w:ind w:left="0" w:firstLine="0"/>
+    </w:pPr>
+    <w:r>
+      <w:rPr>
+        <w:rFonts w:ascii="Calibri" w:eastAsia="Calibri" w:hAnsi="Calibri" w:cs="Calibri"/>
+      </w:rPr>
+      <w:t xml:space="preserve"> </w:t>
+    </w:r>
+  </w:p>
+</w:ftr>
+</file>
+
+<file path=word/footer23.xml><?xml version="1.0" encoding="utf-8"?>
+<w:ftr xmlns:wpc="http://schemas.microsoft.com/office/word/2010/wordprocessingCanvas" xmlns:cx="http://schemas.microsoft.com/office/drawing/2014/chartex" xmlns:cx1="http://schemas.microsoft.com/office/drawing/2015/9/8/chartex" xmlns:cx2="http://schemas.microsoft.com/office/drawing/2015/10/21/chartex" xmlns:cx3="http://schemas.microsoft.com/office/drawing/2016/5/9/chartex" xmlns:cx4="http://schemas.microsoft.com/office/drawing/2016/5/10/chartex" xmlns:cx5="http://schemas.microsoft.com/office/drawing/2016/5/11/chartex" xmlns:cx6="http://schemas.microsoft.com/office/drawing/2016/5/12/chartex" xmlns:cx7="http://schemas.microsoft.com/office/drawing/2016/5/13/chartex" xmlns:cx8="http://schemas.microsoft.com/office/drawing/2016/5/14/chartex" xmlns:mc="http://schemas.openxmlformats.org/markup-compatibility/2006" xmlns:aink="http://schemas.microsoft.com/office/drawing/2016/ink" xmlns:am3d="http://schemas.microsoft.com/office/drawing/2017/model3d" xmlns:o="urn:schemas-microsoft-com:office:office" xmlns:oel="http://schemas.microsoft.com/office/2019/extlst" xmlns:r="http://schemas.openxmlformats.org/officeDocument/2006/relationships" xmlns:m="http://schemas.openxmlformats.org/officeDocument/2006/math" xmlns:v="urn:schemas-microsoft-com:vml" xmlns:wp14="http://schemas.microsoft.com/office/word/2010/wordprocessingDrawing" xmlns:wp="http://schemas.openxmlformats.org/drawingml/2006/wordprocessingDrawing" xmlns:w10="urn:schemas-microsoft-com:office:word" xmlns:w="http://schemas.openxmlformats.org/wordprocessingml/2006/main" xmlns:w14="http://schemas.microsoft.com/office/word/2010/wordml" xmlns:w15="http://schemas.microsoft.com/office/word/2012/wordml" xmlns:w16cei="http://schemas.microsoft.com/office/word/2026/wordml/cei" xmlns:w16cex="http://schemas.microsoft.com/office/word/2018/wordml/cex" xmlns:w16cid="http://schemas.microsoft.com/office/word/2016/wordml/cid" xmlns:w16="http://schemas.microsoft.com/office/word/2018/wordml" xmlns:w16du="http://schemas.microsoft.com/office/word/2023/wordml/word16du" xmlns:w16sdtdh="http://schemas.microsoft.com/office/word/2020/wordml/sdtdatahash" xmlns:w16sdtfl="http://schemas.microsoft.com/office/word/2024/wordml/sdtformatlock" xmlns:w16se="http://schemas.microsoft.com/office/word/2015/wordml/symex" xmlns:wpg="http://schemas.microsoft.com/office/word/2010/wordprocessingGroup" xmlns:wpi="http://schemas.microsoft.com/office/word/2010/wordprocessingInk" xmlns:wne="http://schemas.microsoft.com/office/word/2006/wordml" xmlns:wps="http://schemas.microsoft.com/office/word/2010/wordprocessingShape" mc:Ignorable="w14 w15 w16se w16cid w16 w16cex w16sdtdh w16sdtfl w16du wp14">
+  <w:p>
+    <w:pPr>
+      <w:spacing w:after="0" w:line="259" w:lineRule="auto"/>
+      <w:ind w:left="0" w:right="1" w:firstLine="0"/>
+      <w:jc w:val="right"/>
+    </w:pPr>
+    <w:r>
+      <w:fldChar w:fldCharType="begin"/>
+    </w:r>
+    <w:r>
+      <w:instrText xml:space="preserve"> PAGE   \* MERGEFORMAT </w:instrText>
+    </w:r>
+    <w:r>
+      <w:fldChar w:fldCharType="separate"/>
+    </w:r>
+    <w:r>
+      <w:rPr>
+        <w:rFonts w:eastAsia="Calibri" w:cs="Calibri"/>
+        <w:noProof/>
+      </w:rPr>
+      <w:t>2</w:t>
+    </w:r>
+    <w:r>
+      <w:rPr>
+        <w:rFonts w:eastAsia="Calibri" w:cs="Calibri"/>
+      </w:rPr>
+      <w:fldChar w:fldCharType="end"/>
+    </w:r>
+    <w:r>
+      <w:rPr>
+        <w:rFonts w:eastAsia="Calibri" w:cs="Calibri"/>
+      </w:rPr>
+      <w:t xml:space="preserve"> </w:t>
+    </w:r>
+  </w:p>
+  <w:p>
+    <w:pPr>
+      <w:spacing w:after="0" w:line="259" w:lineRule="auto"/>
+      <w:ind w:left="0" w:firstLine="0"/>
+    </w:pPr>
+    <w:r>
+      <w:rPr>
+        <w:rFonts w:ascii="Calibri" w:eastAsia="Calibri" w:hAnsi="Calibri" w:cs="Calibri"/>
+      </w:rPr>
+      <w:t xml:space="preserve"> </w:t>
+    </w:r>
+  </w:p>
+</w:ftr>
+</file>
+
+<file path=word/footer24.xml><?xml version="1.0" encoding="utf-8"?>
+<w:ftr xmlns:wpc="http://schemas.microsoft.com/office/word/2010/wordprocessingCanvas" xmlns:cx="http://schemas.microsoft.com/office/drawing/2014/chartex" xmlns:cx1="http://schemas.microsoft.com/office/drawing/2015/9/8/chartex" xmlns:cx2="http://schemas.microsoft.com/office/drawing/2015/10/21/chartex" xmlns:cx3="http://schemas.microsoft.com/office/drawing/2016/5/9/chartex" xmlns:cx4="http://schemas.microsoft.com/office/drawing/2016/5/10/chartex" xmlns:cx5="http://schemas.microsoft.com/office/drawing/2016/5/11/chartex" xmlns:cx6="http://schemas.microsoft.com/office/drawing/2016/5/12/chartex" xmlns:cx7="http://schemas.microsoft.com/office/drawing/2016/5/13/chartex" xmlns:cx8="http://schemas.microsoft.com/office/drawing/2016/5/14/chartex" xmlns:mc="http://schemas.openxmlformats.org/markup-compatibility/2006" xmlns:aink="http://schemas.microsoft.com/office/drawing/2016/ink" xmlns:am3d="http://schemas.microsoft.com/office/drawing/2017/model3d" xmlns:o="urn:schemas-microsoft-com:office:office" xmlns:oel="http://schemas.microsoft.com/office/2019/extlst" xmlns:r="http://schemas.openxmlformats.org/officeDocument/2006/relationships" xmlns:m="http://schemas.openxmlformats.org/officeDocument/2006/math" xmlns:v="urn:schemas-microsoft-com:vml" xmlns:wp14="http://schemas.microsoft.com/office/word/2010/wordprocessingDrawing" xmlns:wp="http://schemas.openxmlformats.org/drawingml/2006/wordprocessingDrawing" xmlns:w10="urn:schemas-microsoft-com:office:word" xmlns:w="http://schemas.openxmlformats.org/wordprocessingml/2006/main" xmlns:w14="http://schemas.microsoft.com/office/word/2010/wordml" xmlns:w15="http://schemas.microsoft.com/office/word/2012/wordml" xmlns:w16cei="http://schemas.microsoft.com/office/word/2026/wordml/cei" xmlns:w16cex="http://schemas.microsoft.com/office/word/2018/wordml/cex" xmlns:w16cid="http://schemas.microsoft.com/office/word/2016/wordml/cid" xmlns:w16="http://schemas.microsoft.com/office/word/2018/wordml" xmlns:w16du="http://schemas.microsoft.com/office/word/2023/wordml/word16du" xmlns:w16sdtdh="http://schemas.microsoft.com/office/word/2020/wordml/sdtdatahash" xmlns:w16sdtfl="http://schemas.microsoft.com/office/word/2024/wordml/sdtformatlock" xmlns:w16se="http://schemas.microsoft.com/office/word/2015/wordml/symex" xmlns:wpg="http://schemas.microsoft.com/office/word/2010/wordprocessingGroup" xmlns:wpi="http://schemas.microsoft.com/office/word/2010/wordprocessingInk" xmlns:wne="http://schemas.microsoft.com/office/word/2006/wordml" xmlns:wps="http://schemas.microsoft.com/office/word/2010/wordprocessingShape" mc:Ignorable="w14 w15 w16se w16cid w16 w16cex w16sdtdh w16sdtfl w16du wp14">
+  <w:p>
+    <w:pPr>
+      <w:spacing w:after="0" w:line="259" w:lineRule="auto"/>
+      <w:ind w:left="0" w:right="1" w:firstLine="0"/>
+      <w:jc w:val="right"/>
+    </w:pPr>
+    <w:r>
+      <w:fldChar w:fldCharType="begin"/>
+    </w:r>
+    <w:r>
+      <w:instrText xml:space="preserve"> PAGE   \* MERGEFORMAT </w:instrText>
+    </w:r>
+    <w:r>
+      <w:fldChar w:fldCharType="separate"/>
+    </w:r>
+    <w:r>
+      <w:rPr>
+        <w:rFonts w:eastAsia="Calibri" w:cs="Calibri"/>
+        <w:noProof/>
+      </w:rPr>
+      <w:t>1</w:t>
+    </w:r>
+    <w:r>
+      <w:rPr>
+        <w:rFonts w:eastAsia="Calibri" w:cs="Calibri"/>
+      </w:rPr>
+      <w:fldChar w:fldCharType="end"/>
+    </w:r>
+    <w:r>
+      <w:rPr>
+        <w:rFonts w:eastAsia="Calibri" w:cs="Calibri"/>
+      </w:rPr>
+      <w:t xml:space="preserve"> </w:t>
+    </w:r>
+  </w:p>
+  <w:p>
+    <w:pPr>
+      <w:spacing w:after="0" w:line="259" w:lineRule="auto"/>
+      <w:ind w:left="0" w:firstLine="0"/>
+    </w:pPr>
+    <w:r>
+      <w:rPr>
+        <w:rFonts w:ascii="Calibri" w:eastAsia="Calibri" w:hAnsi="Calibri" w:cs="Calibri"/>
+      </w:rPr>
+      <w:t xml:space="preserve"> </w:t>
+    </w:r>
+  </w:p>
+</w:ftr>
+</file>
+
 <file path=word/footer3.xml><?xml version="1.0" encoding="utf-8"?>
 <w:ftr xmlns:wpc="http://schemas.microsoft.com/office/word/2010/wordprocessingCanvas" xmlns:cx="http://schemas.microsoft.com/office/drawing/2014/chartex" xmlns:cx1="http://schemas.microsoft.com/office/drawing/2015/9/8/chartex" xmlns:cx2="http://schemas.microsoft.com/office/drawing/2015/10/21/chartex" xmlns:cx3="http://schemas.microsoft.com/office/drawing/2016/5/9/chartex" xmlns:cx4="http://schemas.microsoft.com/office/drawing/2016/5/10/chartex" xmlns:cx5="http://schemas.microsoft.com/office/drawing/2016/5/11/chartex" xmlns:cx6="http://schemas.microsoft.com/office/drawing/2016/5/12/chartex" xmlns:cx7="http://schemas.microsoft.com/office/drawing/2016/5/13/chartex" xmlns:cx8="http://schemas.microsoft.com/office/drawing/2016/5/14/chartex" xmlns:mc="http://schemas.openxmlformats.org/markup-compatibility/2006" xmlns:aink="http://schemas.microsoft.com/office/drawing/2016/ink" xmlns:am3d="http://schemas.microsoft.com/office/drawing/2017/model3d" xmlns:o="urn:schemas-microsoft-com:office:office" xmlns:oel="http://schemas.microsoft.com/office/2019/extlst" xmlns:r="http://schemas.openxmlformats.org/officeDocument/2006/relationships" xmlns:m="http://schemas.openxmlformats.org/officeDocument/2006/math" xmlns:v="urn:schemas-microsoft-com:vml" xmlns:wp14="http://schemas.microsoft.com/office/word/2010/wordprocessingDrawing" xmlns:wp="http://schemas.openxmlformats.org/drawingml/2006/wordprocessingDrawing" xmlns:w10="urn:schemas-microsoft-com:office:word" xmlns:w="http://schemas.openxmlformats.org/wordprocessingml/2006/main" xmlns:w14="http://schemas.microsoft.com/office/word/2010/wordml" xmlns:w15="http://schemas.microsoft.com/office/word/2012/wordml" xmlns:w16cei="http://schemas.microsoft.com/office/word/2026/wordml/cei" xmlns:w16cex="http://schemas.microsoft.com/office/word/2018/wordml/cex" xmlns:w16cid="http://schemas.microsoft.com/office/word/2016/wordml/cid" xmlns:w16="http://schemas.microsoft.com/office/word/2018/wordml" xmlns:w16du="http://schemas.microsoft.com/office/word/2023/wordml/word16du" xmlns:w16sdtdh="http://schemas.microsoft.com/office/word/2020/wordml/sdtdatahash" xmlns:w16sdtfl="http://schemas.microsoft.com/office/word/2024/wordml/sdtformatlock" xmlns:w16se="http://schemas.microsoft.com/office/word/2015/wordml/symex" xmlns:wpg="http://schemas.microsoft.com/office/word/2010/wordprocessingGroup" xmlns:wpi="http://schemas.microsoft.com/office/word/2010/wordprocessingInk" xmlns:wne="http://schemas.microsoft.com/office/word/2006/wordml" xmlns:wps="http://schemas.microsoft.com/office/word/2010/wordprocessingShape" mc:Ignorable="w14 w15 w16se w16cid w16 w16cex w16sdtdh w16sdtfl w16du wp14">
   <w:p>
@@ -1824,7 +1790,7 @@
         <w:noProof/>
       </w:rPr>
       <w:drawing>
-        <wp:anchor distT="0" distB="0" distL="114300" distR="114300" simplePos="0" relativeHeight="251651072" behindDoc="0" locked="0" layoutInCell="1" allowOverlap="0" wp14:anchorId="7538061A" wp14:editId="014F1633">
+        <wp:anchor distT="0" distB="0" distL="114300" distR="114300" simplePos="0" relativeHeight="251650048" behindDoc="0" locked="0" layoutInCell="1" allowOverlap="0" wp14:anchorId="58D06495" wp14:editId="4DAF8EDB">
           <wp:simplePos x="0" y="0"/>
           <wp:positionH relativeFrom="page">
             <wp:posOffset>914400</wp:posOffset>
@@ -1900,7 +1866,7 @@
         <w:noProof/>
       </w:rPr>
       <w:drawing>
-        <wp:anchor distT="0" distB="0" distL="114300" distR="114300" simplePos="0" relativeHeight="251658240" behindDoc="0" locked="0" layoutInCell="1" allowOverlap="0" wp14:anchorId="55AF7BD2" wp14:editId="482E0BEC">
+        <wp:anchor distT="0" distB="0" distL="114300" distR="114300" simplePos="0" relativeHeight="251657216" behindDoc="0" locked="0" layoutInCell="1" allowOverlap="0" wp14:anchorId="74011FC5" wp14:editId="6A2CC89E">
           <wp:simplePos x="0" y="0"/>
           <wp:positionH relativeFrom="page">
             <wp:posOffset>914400</wp:posOffset>
@@ -2000,7 +1966,7 @@
         <w:noProof/>
       </w:rPr>
       <w:drawing>
-        <wp:anchor distT="0" distB="0" distL="114300" distR="114300" simplePos="0" relativeHeight="251657216" behindDoc="0" locked="0" layoutInCell="1" allowOverlap="0" wp14:anchorId="37C257E5" wp14:editId="35B2B253">
+        <wp:anchor distT="0" distB="0" distL="114300" distR="114300" simplePos="0" relativeHeight="251656192" behindDoc="0" locked="0" layoutInCell="1" allowOverlap="0" wp14:anchorId="4901BD1A" wp14:editId="62C05D31">
           <wp:simplePos x="0" y="0"/>
           <wp:positionH relativeFrom="page">
             <wp:posOffset>914400</wp:posOffset>
@@ -2058,7 +2024,165 @@
         <w:noProof/>
       </w:rPr>
       <w:drawing>
-        <wp:anchor distT="0" distB="0" distL="114300" distR="114300" simplePos="0" relativeHeight="251659264" behindDoc="0" locked="0" layoutInCell="1" allowOverlap="0" wp14:anchorId="7B057667" wp14:editId="1B9C3D4A">
+        <wp:anchor distT="0" distB="0" distL="114300" distR="114300" simplePos="0" relativeHeight="251663360" behindDoc="0" locked="0" layoutInCell="1" allowOverlap="0" wp14:anchorId="158BBB4B" wp14:editId="2C9CDE73">
+          <wp:simplePos x="0" y="0"/>
+          <wp:positionH relativeFrom="page">
+            <wp:posOffset>914400</wp:posOffset>
+          </wp:positionH>
+          <wp:positionV relativeFrom="page">
+            <wp:posOffset>457200</wp:posOffset>
+          </wp:positionV>
+          <wp:extent cx="5845810" cy="600710"/>
+          <wp:effectExtent l="0" t="0" r="0" b="0"/>
+          <wp:wrapSquare wrapText="bothSides"/>
+          <wp:docPr id="204" name="Picture 204"/>
+          <wp:cNvGraphicFramePr/>
+          <a:graphic xmlns:a="http://schemas.openxmlformats.org/drawingml/2006/main">
+            <a:graphicData uri="http://schemas.openxmlformats.org/drawingml/2006/picture">
+              <pic:pic xmlns:pic="http://schemas.openxmlformats.org/drawingml/2006/picture">
+                <pic:nvPicPr>
+                  <pic:cNvPr id="204" name="Picture 204"/>
+                  <pic:cNvPicPr/>
+                </pic:nvPicPr>
+                <pic:blipFill>
+                  <a:blip r:embed="rId1"/>
+                  <a:stretch>
+                    <a:fillRect/>
+                  </a:stretch>
+                </pic:blipFill>
+                <pic:spPr>
+                  <a:xfrm>
+                    <a:off x="0" y="0"/>
+                    <a:ext cx="5845810" cy="600710"/>
+                  </a:xfrm>
+                  <a:prstGeom prst="rect">
+                    <a:avLst/>
+                  </a:prstGeom>
+                </pic:spPr>
+              </pic:pic>
+            </a:graphicData>
+          </a:graphic>
+        </wp:anchor>
+      </w:drawing>
+    </w:r>
+    <w:r>
+      <w:rPr>
+        <w:rFonts w:ascii="Calibri" w:eastAsia="Calibri" w:hAnsi="Calibri" w:cs="Calibri"/>
+      </w:rPr>
+      <w:t xml:space="preserve"> </w:t>
+    </w:r>
+  </w:p>
+  <w:p>
+    <w:pPr>
+      <w:spacing w:after="0" w:line="259" w:lineRule="auto"/>
+      <w:ind w:left="0" w:firstLine="0"/>
+    </w:pPr>
+    <w:r>
+      <w:rPr>
+        <w:rFonts w:ascii="Calibri" w:eastAsia="Calibri" w:hAnsi="Calibri" w:cs="Calibri"/>
+      </w:rPr>
+      <w:t xml:space="preserve"> </w:t>
+    </w:r>
+  </w:p>
+</w:hdr>
+</file>
+
+<file path=word/header14.xml><?xml version="1.0" encoding="utf-8"?>
+<w:hdr xmlns:wpc="http://schemas.microsoft.com/office/word/2010/wordprocessingCanvas" xmlns:cx="http://schemas.microsoft.com/office/drawing/2014/chartex" xmlns:cx1="http://schemas.microsoft.com/office/drawing/2015/9/8/chartex" xmlns:cx2="http://schemas.microsoft.com/office/drawing/2015/10/21/chartex" xmlns:cx3="http://schemas.microsoft.com/office/drawing/2016/5/9/chartex" xmlns:cx4="http://schemas.microsoft.com/office/drawing/2016/5/10/chartex" xmlns:cx5="http://schemas.microsoft.com/office/drawing/2016/5/11/chartex" xmlns:cx6="http://schemas.microsoft.com/office/drawing/2016/5/12/chartex" xmlns:cx7="http://schemas.microsoft.com/office/drawing/2016/5/13/chartex" xmlns:cx8="http://schemas.microsoft.com/office/drawing/2016/5/14/chartex" xmlns:mc="http://schemas.openxmlformats.org/markup-compatibility/2006" xmlns:aink="http://schemas.microsoft.com/office/drawing/2016/ink" xmlns:am3d="http://schemas.microsoft.com/office/drawing/2017/model3d" xmlns:o="urn:schemas-microsoft-com:office:office" xmlns:oel="http://schemas.microsoft.com/office/2019/extlst" xmlns:r="http://schemas.openxmlformats.org/officeDocument/2006/relationships" xmlns:m="http://schemas.openxmlformats.org/officeDocument/2006/math" xmlns:v="urn:schemas-microsoft-com:vml" xmlns:wp14="http://schemas.microsoft.com/office/word/2010/wordprocessingDrawing" xmlns:wp="http://schemas.openxmlformats.org/drawingml/2006/wordprocessingDrawing" xmlns:w10="urn:schemas-microsoft-com:office:word" xmlns:w="http://schemas.openxmlformats.org/wordprocessingml/2006/main" xmlns:w14="http://schemas.microsoft.com/office/word/2010/wordml" xmlns:w15="http://schemas.microsoft.com/office/word/2012/wordml" xmlns:w16cei="http://schemas.microsoft.com/office/word/2026/wordml/cei" xmlns:w16cex="http://schemas.microsoft.com/office/word/2018/wordml/cex" xmlns:w16cid="http://schemas.microsoft.com/office/word/2016/wordml/cid" xmlns:w16="http://schemas.microsoft.com/office/word/2018/wordml" xmlns:w16du="http://schemas.microsoft.com/office/word/2023/wordml/word16du" xmlns:w16sdtdh="http://schemas.microsoft.com/office/word/2020/wordml/sdtdatahash" xmlns:w16sdtfl="http://schemas.microsoft.com/office/word/2024/wordml/sdtformatlock" xmlns:w16se="http://schemas.microsoft.com/office/word/2015/wordml/symex" xmlns:wpg="http://schemas.microsoft.com/office/word/2010/wordprocessingGroup" xmlns:wpi="http://schemas.microsoft.com/office/word/2010/wordprocessingInk" xmlns:wne="http://schemas.microsoft.com/office/word/2006/wordml" xmlns:wps="http://schemas.microsoft.com/office/word/2010/wordprocessingShape" mc:Ignorable="w14 w15 w16se w16cid w16 w16cex w16sdtdh w16sdtfl w16du wp14">
+  <w:p>
+    <w:pPr>
+      <w:spacing w:after="0" w:line="259" w:lineRule="auto"/>
+      <w:ind w:left="0" w:right="106" w:firstLine="0"/>
+      <w:jc w:val="right"/>
+      <w:rPr>
+        <w:b/>
+        <w:bCs/>
+        <w:noProof/>
+      </w:rPr>
+    </w:pPr>
+    <w:r>
+      <w:rPr>
+        <w:b/>
+        <w:bCs/>
+        <w:noProof/>
+      </w:rPr>
+      <w:t>EENG 385: BJT DC</w:t>
+    </w:r>
+  </w:p>
+</w:hdr>
+</file>
+
+<file path=word/header15.xml><?xml version="1.0" encoding="utf-8"?>
+<w:hdr xmlns:wpc="http://schemas.microsoft.com/office/word/2010/wordprocessingCanvas" xmlns:cx="http://schemas.microsoft.com/office/drawing/2014/chartex" xmlns:cx1="http://schemas.microsoft.com/office/drawing/2015/9/8/chartex" xmlns:cx2="http://schemas.microsoft.com/office/drawing/2015/10/21/chartex" xmlns:cx3="http://schemas.microsoft.com/office/drawing/2016/5/9/chartex" xmlns:cx4="http://schemas.microsoft.com/office/drawing/2016/5/10/chartex" xmlns:cx5="http://schemas.microsoft.com/office/drawing/2016/5/11/chartex" xmlns:cx6="http://schemas.microsoft.com/office/drawing/2016/5/12/chartex" xmlns:cx7="http://schemas.microsoft.com/office/drawing/2016/5/13/chartex" xmlns:cx8="http://schemas.microsoft.com/office/drawing/2016/5/14/chartex" xmlns:mc="http://schemas.openxmlformats.org/markup-compatibility/2006" xmlns:aink="http://schemas.microsoft.com/office/drawing/2016/ink" xmlns:am3d="http://schemas.microsoft.com/office/drawing/2017/model3d" xmlns:o="urn:schemas-microsoft-com:office:office" xmlns:oel="http://schemas.microsoft.com/office/2019/extlst" xmlns:r="http://schemas.openxmlformats.org/officeDocument/2006/relationships" xmlns:m="http://schemas.openxmlformats.org/officeDocument/2006/math" xmlns:v="urn:schemas-microsoft-com:vml" xmlns:wp14="http://schemas.microsoft.com/office/word/2010/wordprocessingDrawing" xmlns:wp="http://schemas.openxmlformats.org/drawingml/2006/wordprocessingDrawing" xmlns:w10="urn:schemas-microsoft-com:office:word" xmlns:w="http://schemas.openxmlformats.org/wordprocessingml/2006/main" xmlns:w14="http://schemas.microsoft.com/office/word/2010/wordml" xmlns:w15="http://schemas.microsoft.com/office/word/2012/wordml" xmlns:w16cei="http://schemas.microsoft.com/office/word/2026/wordml/cei" xmlns:w16cex="http://schemas.microsoft.com/office/word/2018/wordml/cex" xmlns:w16cid="http://schemas.microsoft.com/office/word/2016/wordml/cid" xmlns:w16="http://schemas.microsoft.com/office/word/2018/wordml" xmlns:w16du="http://schemas.microsoft.com/office/word/2023/wordml/word16du" xmlns:w16sdtdh="http://schemas.microsoft.com/office/word/2020/wordml/sdtdatahash" xmlns:w16sdtfl="http://schemas.microsoft.com/office/word/2024/wordml/sdtformatlock" xmlns:w16se="http://schemas.microsoft.com/office/word/2015/wordml/symex" xmlns:wpg="http://schemas.microsoft.com/office/word/2010/wordprocessingGroup" xmlns:wpi="http://schemas.microsoft.com/office/word/2010/wordprocessingInk" xmlns:wne="http://schemas.microsoft.com/office/word/2006/wordml" xmlns:wps="http://schemas.microsoft.com/office/word/2010/wordprocessingShape" mc:Ignorable="w14 w15 w16se w16cid w16 w16cex w16sdtdh w16sdtfl w16du wp14">
+  <w:p>
+    <w:pPr>
+      <w:spacing w:after="0" w:line="259" w:lineRule="auto"/>
+      <w:ind w:left="0" w:right="106" w:firstLine="0"/>
+    </w:pPr>
+    <w:r>
+      <w:rPr>
+        <w:noProof/>
+      </w:rPr>
+      <w:drawing>
+        <wp:anchor distT="0" distB="0" distL="114300" distR="114300" simplePos="0" relativeHeight="251662336" behindDoc="0" locked="0" layoutInCell="1" allowOverlap="0" wp14:anchorId="7A10095F" wp14:editId="544467CA">
+          <wp:simplePos x="0" y="0"/>
+          <wp:positionH relativeFrom="page">
+            <wp:posOffset>914400</wp:posOffset>
+          </wp:positionH>
+          <wp:positionV relativeFrom="page">
+            <wp:posOffset>457200</wp:posOffset>
+          </wp:positionV>
+          <wp:extent cx="5845810" cy="600710"/>
+          <wp:effectExtent l="0" t="0" r="0" b="0"/>
+          <wp:wrapSquare wrapText="bothSides"/>
+          <wp:docPr id="7" name="Picture 7"/>
+          <wp:cNvGraphicFramePr/>
+          <a:graphic xmlns:a="http://schemas.openxmlformats.org/drawingml/2006/main">
+            <a:graphicData uri="http://schemas.openxmlformats.org/drawingml/2006/picture">
+              <pic:pic xmlns:pic="http://schemas.openxmlformats.org/drawingml/2006/picture">
+                <pic:nvPicPr>
+                  <pic:cNvPr id="7" name="Picture 7"/>
+                  <pic:cNvPicPr/>
+                </pic:nvPicPr>
+                <pic:blipFill>
+                  <a:blip r:embed="rId1"/>
+                  <a:stretch>
+                    <a:fillRect/>
+                  </a:stretch>
+                </pic:blipFill>
+                <pic:spPr>
+                  <a:xfrm>
+                    <a:off x="0" y="0"/>
+                    <a:ext cx="5845810" cy="600710"/>
+                  </a:xfrm>
+                  <a:prstGeom prst="rect">
+                    <a:avLst/>
+                  </a:prstGeom>
+                </pic:spPr>
+              </pic:pic>
+            </a:graphicData>
+          </a:graphic>
+        </wp:anchor>
+      </w:drawing>
+    </w:r>
+  </w:p>
+</w:hdr>
+</file>
+
+<file path=word/header16.xml><?xml version="1.0" encoding="utf-8"?>
+<w:hdr xmlns:wpc="http://schemas.microsoft.com/office/word/2010/wordprocessingCanvas" xmlns:cx="http://schemas.microsoft.com/office/drawing/2014/chartex" xmlns:cx1="http://schemas.microsoft.com/office/drawing/2015/9/8/chartex" xmlns:cx2="http://schemas.microsoft.com/office/drawing/2015/10/21/chartex" xmlns:cx3="http://schemas.microsoft.com/office/drawing/2016/5/9/chartex" xmlns:cx4="http://schemas.microsoft.com/office/drawing/2016/5/10/chartex" xmlns:cx5="http://schemas.microsoft.com/office/drawing/2016/5/11/chartex" xmlns:cx6="http://schemas.microsoft.com/office/drawing/2016/5/12/chartex" xmlns:cx7="http://schemas.microsoft.com/office/drawing/2016/5/13/chartex" xmlns:cx8="http://schemas.microsoft.com/office/drawing/2016/5/14/chartex" xmlns:mc="http://schemas.openxmlformats.org/markup-compatibility/2006" xmlns:aink="http://schemas.microsoft.com/office/drawing/2016/ink" xmlns:am3d="http://schemas.microsoft.com/office/drawing/2017/model3d" xmlns:o="urn:schemas-microsoft-com:office:office" xmlns:oel="http://schemas.microsoft.com/office/2019/extlst" xmlns:r="http://schemas.openxmlformats.org/officeDocument/2006/relationships" xmlns:m="http://schemas.openxmlformats.org/officeDocument/2006/math" xmlns:v="urn:schemas-microsoft-com:vml" xmlns:wp14="http://schemas.microsoft.com/office/word/2010/wordprocessingDrawing" xmlns:wp="http://schemas.openxmlformats.org/drawingml/2006/wordprocessingDrawing" xmlns:w10="urn:schemas-microsoft-com:office:word" xmlns:w="http://schemas.openxmlformats.org/wordprocessingml/2006/main" xmlns:w14="http://schemas.microsoft.com/office/word/2010/wordml" xmlns:w15="http://schemas.microsoft.com/office/word/2012/wordml" xmlns:w16cei="http://schemas.microsoft.com/office/word/2026/wordml/cei" xmlns:w16cex="http://schemas.microsoft.com/office/word/2018/wordml/cex" xmlns:w16cid="http://schemas.microsoft.com/office/word/2016/wordml/cid" xmlns:w16="http://schemas.microsoft.com/office/word/2018/wordml" xmlns:w16du="http://schemas.microsoft.com/office/word/2023/wordml/word16du" xmlns:w16sdtdh="http://schemas.microsoft.com/office/word/2020/wordml/sdtdatahash" xmlns:w16sdtfl="http://schemas.microsoft.com/office/word/2024/wordml/sdtformatlock" xmlns:w16se="http://schemas.microsoft.com/office/word/2015/wordml/symex" xmlns:wpg="http://schemas.microsoft.com/office/word/2010/wordprocessingGroup" xmlns:wpi="http://schemas.microsoft.com/office/word/2010/wordprocessingInk" xmlns:wne="http://schemas.microsoft.com/office/word/2006/wordml" xmlns:wps="http://schemas.microsoft.com/office/word/2010/wordprocessingShape" mc:Ignorable="w14 w15 w16se w16cid w16 w16cex w16sdtdh w16sdtfl w16du wp14">
+  <w:p>
+    <w:pPr>
+      <w:spacing w:after="0" w:line="259" w:lineRule="auto"/>
+      <w:ind w:left="0" w:right="106" w:firstLine="0"/>
+      <w:jc w:val="right"/>
+    </w:pPr>
+    <w:r>
+      <w:rPr>
+        <w:noProof/>
+      </w:rPr>
+      <w:drawing>
+        <wp:anchor distT="0" distB="0" distL="114300" distR="114300" simplePos="0" relativeHeight="251658240" behindDoc="0" locked="0" layoutInCell="1" allowOverlap="0" wp14:anchorId="365BB053" wp14:editId="7688271B">
           <wp:simplePos x="0" y="0"/>
           <wp:positionH relativeFrom="page">
             <wp:posOffset>914400</wp:posOffset>
@@ -2121,7 +2245,7 @@
 </w:hdr>
 </file>
 
-<file path=word/header14.xml><?xml version="1.0" encoding="utf-8"?>
+<file path=word/header17.xml><?xml version="1.0" encoding="utf-8"?>
 <w:hdr xmlns:wpc="http://schemas.microsoft.com/office/word/2010/wordprocessingCanvas" xmlns:cx="http://schemas.microsoft.com/office/drawing/2014/chartex" xmlns:cx1="http://schemas.microsoft.com/office/drawing/2015/9/8/chartex" xmlns:cx2="http://schemas.microsoft.com/office/drawing/2015/10/21/chartex" xmlns:cx3="http://schemas.microsoft.com/office/drawing/2016/5/9/chartex" xmlns:cx4="http://schemas.microsoft.com/office/drawing/2016/5/10/chartex" xmlns:cx5="http://schemas.microsoft.com/office/drawing/2016/5/11/chartex" xmlns:cx6="http://schemas.microsoft.com/office/drawing/2016/5/12/chartex" xmlns:cx7="http://schemas.microsoft.com/office/drawing/2016/5/13/chartex" xmlns:cx8="http://schemas.microsoft.com/office/drawing/2016/5/14/chartex" xmlns:mc="http://schemas.openxmlformats.org/markup-compatibility/2006" xmlns:aink="http://schemas.microsoft.com/office/drawing/2016/ink" xmlns:am3d="http://schemas.microsoft.com/office/drawing/2017/model3d" xmlns:o="urn:schemas-microsoft-com:office:office" xmlns:oel="http://schemas.microsoft.com/office/2019/extlst" xmlns:r="http://schemas.openxmlformats.org/officeDocument/2006/relationships" xmlns:m="http://schemas.openxmlformats.org/officeDocument/2006/math" xmlns:v="urn:schemas-microsoft-com:vml" xmlns:wp14="http://schemas.microsoft.com/office/word/2010/wordprocessingDrawing" xmlns:wp="http://schemas.openxmlformats.org/drawingml/2006/wordprocessingDrawing" xmlns:w10="urn:schemas-microsoft-com:office:word" xmlns:w="http://schemas.openxmlformats.org/wordprocessingml/2006/main" xmlns:w14="http://schemas.microsoft.com/office/word/2010/wordml" xmlns:w15="http://schemas.microsoft.com/office/word/2012/wordml" xmlns:w16cei="http://schemas.microsoft.com/office/word/2026/wordml/cei" xmlns:w16cex="http://schemas.microsoft.com/office/word/2018/wordml/cex" xmlns:w16cid="http://schemas.microsoft.com/office/word/2016/wordml/cid" xmlns:w16="http://schemas.microsoft.com/office/word/2018/wordml" xmlns:w16du="http://schemas.microsoft.com/office/word/2023/wordml/word16du" xmlns:w16sdtdh="http://schemas.microsoft.com/office/word/2020/wordml/sdtdatahash" xmlns:w16sdtfl="http://schemas.microsoft.com/office/word/2024/wordml/sdtformatlock" xmlns:w16se="http://schemas.microsoft.com/office/word/2015/wordml/symex" xmlns:wpg="http://schemas.microsoft.com/office/word/2010/wordprocessingGroup" xmlns:wpi="http://schemas.microsoft.com/office/word/2010/wordprocessingInk" xmlns:wne="http://schemas.microsoft.com/office/word/2006/wordml" xmlns:wps="http://schemas.microsoft.com/office/word/2010/wordprocessingShape" mc:Ignorable="w14 w15 w16se w16cid w16 w16cex w16sdtdh w16sdtfl w16du wp14">
   <w:p>
     <w:pPr>
@@ -2146,7 +2270,7 @@
 </w:hdr>
 </file>
 
-<file path=word/header15.xml><?xml version="1.0" encoding="utf-8"?>
+<file path=word/header18.xml><?xml version="1.0" encoding="utf-8"?>
 <w:hdr xmlns:wpc="http://schemas.microsoft.com/office/word/2010/wordprocessingCanvas" xmlns:cx="http://schemas.microsoft.com/office/drawing/2014/chartex" xmlns:cx1="http://schemas.microsoft.com/office/drawing/2015/9/8/chartex" xmlns:cx2="http://schemas.microsoft.com/office/drawing/2015/10/21/chartex" xmlns:cx3="http://schemas.microsoft.com/office/drawing/2016/5/9/chartex" xmlns:cx4="http://schemas.microsoft.com/office/drawing/2016/5/10/chartex" xmlns:cx5="http://schemas.microsoft.com/office/drawing/2016/5/11/chartex" xmlns:cx6="http://schemas.microsoft.com/office/drawing/2016/5/12/chartex" xmlns:cx7="http://schemas.microsoft.com/office/drawing/2016/5/13/chartex" xmlns:cx8="http://schemas.microsoft.com/office/drawing/2016/5/14/chartex" xmlns:mc="http://schemas.openxmlformats.org/markup-compatibility/2006" xmlns:aink="http://schemas.microsoft.com/office/drawing/2016/ink" xmlns:am3d="http://schemas.microsoft.com/office/drawing/2017/model3d" xmlns:o="urn:schemas-microsoft-com:office:office" xmlns:oel="http://schemas.microsoft.com/office/2019/extlst" xmlns:r="http://schemas.openxmlformats.org/officeDocument/2006/relationships" xmlns:m="http://schemas.openxmlformats.org/officeDocument/2006/math" xmlns:v="urn:schemas-microsoft-com:vml" xmlns:wp14="http://schemas.microsoft.com/office/word/2010/wordprocessingDrawing" xmlns:wp="http://schemas.openxmlformats.org/drawingml/2006/wordprocessingDrawing" xmlns:w10="urn:schemas-microsoft-com:office:word" xmlns:w="http://schemas.openxmlformats.org/wordprocessingml/2006/main" xmlns:w14="http://schemas.microsoft.com/office/word/2010/wordml" xmlns:w15="http://schemas.microsoft.com/office/word/2012/wordml" xmlns:w16cei="http://schemas.microsoft.com/office/word/2026/wordml/cei" xmlns:w16cex="http://schemas.microsoft.com/office/word/2018/wordml/cex" xmlns:w16cid="http://schemas.microsoft.com/office/word/2016/wordml/cid" xmlns:w16="http://schemas.microsoft.com/office/word/2018/wordml" xmlns:w16du="http://schemas.microsoft.com/office/word/2023/wordml/word16du" xmlns:w16sdtdh="http://schemas.microsoft.com/office/word/2020/wordml/sdtdatahash" xmlns:w16sdtfl="http://schemas.microsoft.com/office/word/2024/wordml/sdtformatlock" xmlns:w16se="http://schemas.microsoft.com/office/word/2015/wordml/symex" xmlns:wpg="http://schemas.microsoft.com/office/word/2010/wordprocessingGroup" xmlns:wpi="http://schemas.microsoft.com/office/word/2010/wordprocessingInk" xmlns:wne="http://schemas.microsoft.com/office/word/2006/wordml" xmlns:wps="http://schemas.microsoft.com/office/word/2010/wordprocessingShape" mc:Ignorable="w14 w15 w16se w16cid w16 w16cex w16sdtdh w16sdtfl w16du wp14">
   <w:p>
     <w:pPr>
@@ -2158,7 +2282,7 @@
         <w:noProof/>
       </w:rPr>
       <w:drawing>
-        <wp:anchor distT="0" distB="0" distL="114300" distR="114300" simplePos="0" relativeHeight="251660288" behindDoc="0" locked="0" layoutInCell="1" allowOverlap="0" wp14:anchorId="0EF70F44" wp14:editId="3711621F">
+        <wp:anchor distT="0" distB="0" distL="114300" distR="114300" simplePos="0" relativeHeight="251659264" behindDoc="0" locked="0" layoutInCell="1" allowOverlap="0" wp14:anchorId="64903BEF" wp14:editId="0C5825F4">
           <wp:simplePos x="0" y="0"/>
           <wp:positionH relativeFrom="page">
             <wp:posOffset>914400</wp:posOffset>
@@ -2203,7 +2327,7 @@
 </w:hdr>
 </file>
 
-<file path=word/header16.xml><?xml version="1.0" encoding="utf-8"?>
+<file path=word/header19.xml><?xml version="1.0" encoding="utf-8"?>
 <w:hdr xmlns:wpc="http://schemas.microsoft.com/office/word/2010/wordprocessingCanvas" xmlns:cx="http://schemas.microsoft.com/office/drawing/2014/chartex" xmlns:cx1="http://schemas.microsoft.com/office/drawing/2015/9/8/chartex" xmlns:cx2="http://schemas.microsoft.com/office/drawing/2015/10/21/chartex" xmlns:cx3="http://schemas.microsoft.com/office/drawing/2016/5/9/chartex" xmlns:cx4="http://schemas.microsoft.com/office/drawing/2016/5/10/chartex" xmlns:cx5="http://schemas.microsoft.com/office/drawing/2016/5/11/chartex" xmlns:cx6="http://schemas.microsoft.com/office/drawing/2016/5/12/chartex" xmlns:cx7="http://schemas.microsoft.com/office/drawing/2016/5/13/chartex" xmlns:cx8="http://schemas.microsoft.com/office/drawing/2016/5/14/chartex" xmlns:mc="http://schemas.openxmlformats.org/markup-compatibility/2006" xmlns:aink="http://schemas.microsoft.com/office/drawing/2016/ink" xmlns:am3d="http://schemas.microsoft.com/office/drawing/2017/model3d" xmlns:o="urn:schemas-microsoft-com:office:office" xmlns:oel="http://schemas.microsoft.com/office/2019/extlst" xmlns:r="http://schemas.openxmlformats.org/officeDocument/2006/relationships" xmlns:m="http://schemas.openxmlformats.org/officeDocument/2006/math" xmlns:v="urn:schemas-microsoft-com:vml" xmlns:wp14="http://schemas.microsoft.com/office/word/2010/wordprocessingDrawing" xmlns:wp="http://schemas.openxmlformats.org/drawingml/2006/wordprocessingDrawing" xmlns:w10="urn:schemas-microsoft-com:office:word" xmlns:w="http://schemas.openxmlformats.org/wordprocessingml/2006/main" xmlns:w14="http://schemas.microsoft.com/office/word/2010/wordml" xmlns:w15="http://schemas.microsoft.com/office/word/2012/wordml" xmlns:w16cei="http://schemas.microsoft.com/office/word/2026/wordml/cei" xmlns:w16cex="http://schemas.microsoft.com/office/word/2018/wordml/cex" xmlns:w16cid="http://schemas.microsoft.com/office/word/2016/wordml/cid" xmlns:w16="http://schemas.microsoft.com/office/word/2018/wordml" xmlns:w16du="http://schemas.microsoft.com/office/word/2023/wordml/word16du" xmlns:w16sdtdh="http://schemas.microsoft.com/office/word/2020/wordml/sdtdatahash" xmlns:w16sdtfl="http://schemas.microsoft.com/office/word/2024/wordml/sdtformatlock" xmlns:w16se="http://schemas.microsoft.com/office/word/2015/wordml/symex" xmlns:wpg="http://schemas.microsoft.com/office/word/2010/wordprocessingGroup" xmlns:wpi="http://schemas.microsoft.com/office/word/2010/wordprocessingInk" xmlns:wne="http://schemas.microsoft.com/office/word/2006/wordml" xmlns:wps="http://schemas.microsoft.com/office/word/2010/wordprocessingShape" mc:Ignorable="w14 w15 w16se w16cid w16 w16cex w16sdtdh w16sdtfl w16du wp14">
   <w:p>
     <w:pPr>
@@ -2216,7 +2340,7 @@
         <w:noProof/>
       </w:rPr>
       <w:drawing>
-        <wp:anchor distT="0" distB="0" distL="114300" distR="114300" simplePos="0" relativeHeight="251662336" behindDoc="0" locked="0" layoutInCell="1" allowOverlap="0" wp14:anchorId="4815824A" wp14:editId="7C3424F3">
+        <wp:anchor distT="0" distB="0" distL="114300" distR="114300" simplePos="0" relativeHeight="251661312" behindDoc="0" locked="0" layoutInCell="1" allowOverlap="0" wp14:anchorId="1BE4C32E" wp14:editId="322085D1">
           <wp:simplePos x="0" y="0"/>
           <wp:positionH relativeFrom="page">
             <wp:posOffset>914400</wp:posOffset>
@@ -2279,7 +2403,7 @@
 </w:hdr>
 </file>
 
-<file path=word/header17.xml><?xml version="1.0" encoding="utf-8"?>
+<file path=word/header2.xml><?xml version="1.0" encoding="utf-8"?>
 <w:hdr xmlns:wpc="http://schemas.microsoft.com/office/word/2010/wordprocessingCanvas" xmlns:cx="http://schemas.microsoft.com/office/drawing/2014/chartex" xmlns:cx1="http://schemas.microsoft.com/office/drawing/2015/9/8/chartex" xmlns:cx2="http://schemas.microsoft.com/office/drawing/2015/10/21/chartex" xmlns:cx3="http://schemas.microsoft.com/office/drawing/2016/5/9/chartex" xmlns:cx4="http://schemas.microsoft.com/office/drawing/2016/5/10/chartex" xmlns:cx5="http://schemas.microsoft.com/office/drawing/2016/5/11/chartex" xmlns:cx6="http://schemas.microsoft.com/office/drawing/2016/5/12/chartex" xmlns:cx7="http://schemas.microsoft.com/office/drawing/2016/5/13/chartex" xmlns:cx8="http://schemas.microsoft.com/office/drawing/2016/5/14/chartex" xmlns:mc="http://schemas.openxmlformats.org/markup-compatibility/2006" xmlns:aink="http://schemas.microsoft.com/office/drawing/2016/ink" xmlns:am3d="http://schemas.microsoft.com/office/drawing/2017/model3d" xmlns:o="urn:schemas-microsoft-com:office:office" xmlns:oel="http://schemas.microsoft.com/office/2019/extlst" xmlns:r="http://schemas.openxmlformats.org/officeDocument/2006/relationships" xmlns:m="http://schemas.openxmlformats.org/officeDocument/2006/math" xmlns:v="urn:schemas-microsoft-com:vml" xmlns:wp14="http://schemas.microsoft.com/office/word/2010/wordprocessingDrawing" xmlns:wp="http://schemas.openxmlformats.org/drawingml/2006/wordprocessingDrawing" xmlns:w10="urn:schemas-microsoft-com:office:word" xmlns:w="http://schemas.openxmlformats.org/wordprocessingml/2006/main" xmlns:w14="http://schemas.microsoft.com/office/word/2010/wordml" xmlns:w15="http://schemas.microsoft.com/office/word/2012/wordml" xmlns:w16cei="http://schemas.microsoft.com/office/word/2026/wordml/cei" xmlns:w16cex="http://schemas.microsoft.com/office/word/2018/wordml/cex" xmlns:w16cid="http://schemas.microsoft.com/office/word/2016/wordml/cid" xmlns:w16="http://schemas.microsoft.com/office/word/2018/wordml" xmlns:w16du="http://schemas.microsoft.com/office/word/2023/wordml/word16du" xmlns:w16sdtdh="http://schemas.microsoft.com/office/word/2020/wordml/sdtdatahash" xmlns:w16sdtfl="http://schemas.microsoft.com/office/word/2024/wordml/sdtformatlock" xmlns:w16se="http://schemas.microsoft.com/office/word/2015/wordml/symex" xmlns:wpg="http://schemas.microsoft.com/office/word/2010/wordprocessingGroup" xmlns:wpi="http://schemas.microsoft.com/office/word/2010/wordprocessingInk" xmlns:wne="http://schemas.microsoft.com/office/word/2006/wordml" xmlns:wps="http://schemas.microsoft.com/office/word/2010/wordprocessingShape" mc:Ignorable="w14 w15 w16se w16cid w16 w16cex w16sdtdh w16sdtfl w16du wp14">
   <w:p>
     <w:pPr>
@@ -2293,13 +2417,13 @@
         <w:bCs/>
         <w:noProof/>
       </w:rPr>
-      <w:t>EENG 385: Frequency Reponse</w:t>
+      <w:t>EENG 385: MOSFET</w:t>
     </w:r>
   </w:p>
 </w:hdr>
 </file>
 
-<file path=word/header18.xml><?xml version="1.0" encoding="utf-8"?>
+<file path=word/header20.xml><?xml version="1.0" encoding="utf-8"?>
 <w:hdr xmlns:wpc="http://schemas.microsoft.com/office/word/2010/wordprocessingCanvas" xmlns:cx="http://schemas.microsoft.com/office/drawing/2014/chartex" xmlns:cx1="http://schemas.microsoft.com/office/drawing/2015/9/8/chartex" xmlns:cx2="http://schemas.microsoft.com/office/drawing/2015/10/21/chartex" xmlns:cx3="http://schemas.microsoft.com/office/drawing/2016/5/9/chartex" xmlns:cx4="http://schemas.microsoft.com/office/drawing/2016/5/10/chartex" xmlns:cx5="http://schemas.microsoft.com/office/drawing/2016/5/11/chartex" xmlns:cx6="http://schemas.microsoft.com/office/drawing/2016/5/12/chartex" xmlns:cx7="http://schemas.microsoft.com/office/drawing/2016/5/13/chartex" xmlns:cx8="http://schemas.microsoft.com/office/drawing/2016/5/14/chartex" xmlns:mc="http://schemas.openxmlformats.org/markup-compatibility/2006" xmlns:aink="http://schemas.microsoft.com/office/drawing/2016/ink" xmlns:am3d="http://schemas.microsoft.com/office/drawing/2017/model3d" xmlns:o="urn:schemas-microsoft-com:office:office" xmlns:oel="http://schemas.microsoft.com/office/2019/extlst" xmlns:r="http://schemas.openxmlformats.org/officeDocument/2006/relationships" xmlns:m="http://schemas.openxmlformats.org/officeDocument/2006/math" xmlns:v="urn:schemas-microsoft-com:vml" xmlns:wp14="http://schemas.microsoft.com/office/word/2010/wordprocessingDrawing" xmlns:wp="http://schemas.openxmlformats.org/drawingml/2006/wordprocessingDrawing" xmlns:w10="urn:schemas-microsoft-com:office:word" xmlns:w="http://schemas.openxmlformats.org/wordprocessingml/2006/main" xmlns:w14="http://schemas.microsoft.com/office/word/2010/wordml" xmlns:w15="http://schemas.microsoft.com/office/word/2012/wordml" xmlns:w16cei="http://schemas.microsoft.com/office/word/2026/wordml/cei" xmlns:w16cex="http://schemas.microsoft.com/office/word/2018/wordml/cex" xmlns:w16cid="http://schemas.microsoft.com/office/word/2016/wordml/cid" xmlns:w16="http://schemas.microsoft.com/office/word/2018/wordml" xmlns:w16du="http://schemas.microsoft.com/office/word/2023/wordml/word16du" xmlns:w16sdtdh="http://schemas.microsoft.com/office/word/2020/wordml/sdtdatahash" xmlns:w16sdtfl="http://schemas.microsoft.com/office/word/2024/wordml/sdtformatlock" xmlns:w16se="http://schemas.microsoft.com/office/word/2015/wordml/symex" xmlns:wpg="http://schemas.microsoft.com/office/word/2010/wordprocessingGroup" xmlns:wpi="http://schemas.microsoft.com/office/word/2010/wordprocessingInk" xmlns:wne="http://schemas.microsoft.com/office/word/2006/wordml" xmlns:wps="http://schemas.microsoft.com/office/word/2010/wordprocessingShape" mc:Ignorable="w14 w15 w16se w16cid w16 w16cex w16sdtdh w16sdtfl w16du wp14">
   <w:p>
     <w:pPr>
@@ -2309,10 +2433,30 @@
     </w:pPr>
     <w:r>
       <w:rPr>
+        <w:b/>
+        <w:bCs/>
         <w:noProof/>
       </w:rPr>
+      <w:t>EENG 385: Frequency Reponse</w:t>
+    </w:r>
+  </w:p>
+</w:hdr>
+</file>
+
+<file path=word/header21.xml><?xml version="1.0" encoding="utf-8"?>
+<w:hdr xmlns:wpc="http://schemas.microsoft.com/office/word/2010/wordprocessingCanvas" xmlns:cx="http://schemas.microsoft.com/office/drawing/2014/chartex" xmlns:cx1="http://schemas.microsoft.com/office/drawing/2015/9/8/chartex" xmlns:cx2="http://schemas.microsoft.com/office/drawing/2015/10/21/chartex" xmlns:cx3="http://schemas.microsoft.com/office/drawing/2016/5/9/chartex" xmlns:cx4="http://schemas.microsoft.com/office/drawing/2016/5/10/chartex" xmlns:cx5="http://schemas.microsoft.com/office/drawing/2016/5/11/chartex" xmlns:cx6="http://schemas.microsoft.com/office/drawing/2016/5/12/chartex" xmlns:cx7="http://schemas.microsoft.com/office/drawing/2016/5/13/chartex" xmlns:cx8="http://schemas.microsoft.com/office/drawing/2016/5/14/chartex" xmlns:mc="http://schemas.openxmlformats.org/markup-compatibility/2006" xmlns:aink="http://schemas.microsoft.com/office/drawing/2016/ink" xmlns:am3d="http://schemas.microsoft.com/office/drawing/2017/model3d" xmlns:o="urn:schemas-microsoft-com:office:office" xmlns:oel="http://schemas.microsoft.com/office/2019/extlst" xmlns:r="http://schemas.openxmlformats.org/officeDocument/2006/relationships" xmlns:m="http://schemas.openxmlformats.org/officeDocument/2006/math" xmlns:v="urn:schemas-microsoft-com:vml" xmlns:wp14="http://schemas.microsoft.com/office/word/2010/wordprocessingDrawing" xmlns:wp="http://schemas.openxmlformats.org/drawingml/2006/wordprocessingDrawing" xmlns:w10="urn:schemas-microsoft-com:office:word" xmlns:w="http://schemas.openxmlformats.org/wordprocessingml/2006/main" xmlns:w14="http://schemas.microsoft.com/office/word/2010/wordml" xmlns:w15="http://schemas.microsoft.com/office/word/2012/wordml" xmlns:w16cei="http://schemas.microsoft.com/office/word/2026/wordml/cei" xmlns:w16cex="http://schemas.microsoft.com/office/word/2018/wordml/cex" xmlns:w16cid="http://schemas.microsoft.com/office/word/2016/wordml/cid" xmlns:w16="http://schemas.microsoft.com/office/word/2018/wordml" xmlns:w16du="http://schemas.microsoft.com/office/word/2023/wordml/word16du" xmlns:w16sdtdh="http://schemas.microsoft.com/office/word/2020/wordml/sdtdatahash" xmlns:w16sdtfl="http://schemas.microsoft.com/office/word/2024/wordml/sdtformatlock" xmlns:w16se="http://schemas.microsoft.com/office/word/2015/wordml/symex" xmlns:wpg="http://schemas.microsoft.com/office/word/2010/wordprocessingGroup" xmlns:wpi="http://schemas.microsoft.com/office/word/2010/wordprocessingInk" xmlns:wne="http://schemas.microsoft.com/office/word/2006/wordml" xmlns:wps="http://schemas.microsoft.com/office/word/2010/wordprocessingShape" mc:Ignorable="w14 w15 w16se w16cid w16 w16cex w16sdtdh w16sdtfl w16du wp14">
+  <w:p>
+    <w:pPr>
+      <w:spacing w:after="0" w:line="259" w:lineRule="auto"/>
+      <w:ind w:left="0" w:right="106" w:firstLine="0"/>
+      <w:jc w:val="right"/>
+    </w:pPr>
+    <w:r>
+      <w:rPr>
+        <w:noProof/>
+      </w:rPr>
       <w:drawing>
-        <wp:anchor distT="0" distB="0" distL="114300" distR="114300" simplePos="0" relativeHeight="251661312" behindDoc="0" locked="0" layoutInCell="1" allowOverlap="0" wp14:anchorId="10216AD8" wp14:editId="6D0C8B66">
+        <wp:anchor distT="0" distB="0" distL="114300" distR="114300" simplePos="0" relativeHeight="251660288" behindDoc="0" locked="0" layoutInCell="1" allowOverlap="0" wp14:anchorId="174EA343" wp14:editId="3ED9F38B">
           <wp:simplePos x="0" y="0"/>
           <wp:positionH relativeFrom="page">
             <wp:posOffset>914400</wp:posOffset>
@@ -2363,7 +2507,7 @@
 </w:hdr>
 </file>
 
-<file path=word/header19.xml><?xml version="1.0" encoding="utf-8"?>
+<file path=word/header22.xml><?xml version="1.0" encoding="utf-8"?>
 <w:hdr xmlns:wpc="http://schemas.microsoft.com/office/word/2010/wordprocessingCanvas" xmlns:cx="http://schemas.microsoft.com/office/drawing/2014/chartex" xmlns:cx1="http://schemas.microsoft.com/office/drawing/2015/9/8/chartex" xmlns:cx2="http://schemas.microsoft.com/office/drawing/2015/10/21/chartex" xmlns:cx3="http://schemas.microsoft.com/office/drawing/2016/5/9/chartex" xmlns:cx4="http://schemas.microsoft.com/office/drawing/2016/5/10/chartex" xmlns:cx5="http://schemas.microsoft.com/office/drawing/2016/5/11/chartex" xmlns:cx6="http://schemas.microsoft.com/office/drawing/2016/5/12/chartex" xmlns:cx7="http://schemas.microsoft.com/office/drawing/2016/5/13/chartex" xmlns:cx8="http://schemas.microsoft.com/office/drawing/2016/5/14/chartex" xmlns:mc="http://schemas.openxmlformats.org/markup-compatibility/2006" xmlns:aink="http://schemas.microsoft.com/office/drawing/2016/ink" xmlns:am3d="http://schemas.microsoft.com/office/drawing/2017/model3d" xmlns:o="urn:schemas-microsoft-com:office:office" xmlns:oel="http://schemas.microsoft.com/office/2019/extlst" xmlns:r="http://schemas.openxmlformats.org/officeDocument/2006/relationships" xmlns:m="http://schemas.openxmlformats.org/officeDocument/2006/math" xmlns:v="urn:schemas-microsoft-com:vml" xmlns:wp14="http://schemas.microsoft.com/office/word/2010/wordprocessingDrawing" xmlns:wp="http://schemas.openxmlformats.org/drawingml/2006/wordprocessingDrawing" xmlns:w10="urn:schemas-microsoft-com:office:word" xmlns:w="http://schemas.openxmlformats.org/wordprocessingml/2006/main" xmlns:w14="http://schemas.microsoft.com/office/word/2010/wordml" xmlns:w15="http://schemas.microsoft.com/office/word/2012/wordml" xmlns:w16cei="http://schemas.microsoft.com/office/word/2026/wordml/cei" xmlns:w16cex="http://schemas.microsoft.com/office/word/2018/wordml/cex" xmlns:w16cid="http://schemas.microsoft.com/office/word/2016/wordml/cid" xmlns:w16="http://schemas.microsoft.com/office/word/2018/wordml" xmlns:w16du="http://schemas.microsoft.com/office/word/2023/wordml/word16du" xmlns:w16sdtdh="http://schemas.microsoft.com/office/word/2020/wordml/sdtdatahash" xmlns:w16sdtfl="http://schemas.microsoft.com/office/word/2024/wordml/sdtformatlock" xmlns:w16se="http://schemas.microsoft.com/office/word/2015/wordml/symex" xmlns:wpg="http://schemas.microsoft.com/office/word/2010/wordprocessingGroup" xmlns:wpi="http://schemas.microsoft.com/office/word/2010/wordprocessingInk" xmlns:wne="http://schemas.microsoft.com/office/word/2006/wordml" xmlns:wps="http://schemas.microsoft.com/office/word/2010/wordprocessingShape" mc:Ignorable="w14 w15 w16se w16cid w16 w16cex w16sdtdh w16sdtfl w16du wp14">
   <w:p>
     <w:pPr>
@@ -2376,7 +2520,7 @@
         <w:noProof/>
       </w:rPr>
       <w:drawing>
-        <wp:anchor distT="0" distB="0" distL="114300" distR="114300" simplePos="0" relativeHeight="251664384" behindDoc="0" locked="0" layoutInCell="1" allowOverlap="0" wp14:anchorId="038BAAD2" wp14:editId="2024F376">
+        <wp:anchor distT="0" distB="0" distL="114300" distR="114300" simplePos="0" relativeHeight="251669504" behindDoc="0" locked="0" layoutInCell="1" allowOverlap="0" wp14:anchorId="1DAFFFB4" wp14:editId="03F168AC">
           <wp:simplePos x="0" y="0"/>
           <wp:positionH relativeFrom="page">
             <wp:posOffset>914400</wp:posOffset>
@@ -2439,7 +2583,7 @@
 </w:hdr>
 </file>
 
-<file path=word/header2.xml><?xml version="1.0" encoding="utf-8"?>
+<file path=word/header23.xml><?xml version="1.0" encoding="utf-8"?>
 <w:hdr xmlns:wpc="http://schemas.microsoft.com/office/word/2010/wordprocessingCanvas" xmlns:cx="http://schemas.microsoft.com/office/drawing/2014/chartex" xmlns:cx1="http://schemas.microsoft.com/office/drawing/2015/9/8/chartex" xmlns:cx2="http://schemas.microsoft.com/office/drawing/2015/10/21/chartex" xmlns:cx3="http://schemas.microsoft.com/office/drawing/2016/5/9/chartex" xmlns:cx4="http://schemas.microsoft.com/office/drawing/2016/5/10/chartex" xmlns:cx5="http://schemas.microsoft.com/office/drawing/2016/5/11/chartex" xmlns:cx6="http://schemas.microsoft.com/office/drawing/2016/5/12/chartex" xmlns:cx7="http://schemas.microsoft.com/office/drawing/2016/5/13/chartex" xmlns:cx8="http://schemas.microsoft.com/office/drawing/2016/5/14/chartex" xmlns:mc="http://schemas.openxmlformats.org/markup-compatibility/2006" xmlns:aink="http://schemas.microsoft.com/office/drawing/2016/ink" xmlns:am3d="http://schemas.microsoft.com/office/drawing/2017/model3d" xmlns:o="urn:schemas-microsoft-com:office:office" xmlns:oel="http://schemas.microsoft.com/office/2019/extlst" xmlns:r="http://schemas.openxmlformats.org/officeDocument/2006/relationships" xmlns:m="http://schemas.openxmlformats.org/officeDocument/2006/math" xmlns:v="urn:schemas-microsoft-com:vml" xmlns:wp14="http://schemas.microsoft.com/office/word/2010/wordprocessingDrawing" xmlns:wp="http://schemas.openxmlformats.org/drawingml/2006/wordprocessingDrawing" xmlns:w10="urn:schemas-microsoft-com:office:word" xmlns:w="http://schemas.openxmlformats.org/wordprocessingml/2006/main" xmlns:w14="http://schemas.microsoft.com/office/word/2010/wordml" xmlns:w15="http://schemas.microsoft.com/office/word/2012/wordml" xmlns:w16cei="http://schemas.microsoft.com/office/word/2026/wordml/cei" xmlns:w16cex="http://schemas.microsoft.com/office/word/2018/wordml/cex" xmlns:w16cid="http://schemas.microsoft.com/office/word/2016/wordml/cid" xmlns:w16="http://schemas.microsoft.com/office/word/2018/wordml" xmlns:w16du="http://schemas.microsoft.com/office/word/2023/wordml/word16du" xmlns:w16sdtdh="http://schemas.microsoft.com/office/word/2020/wordml/sdtdatahash" xmlns:w16sdtfl="http://schemas.microsoft.com/office/word/2024/wordml/sdtformatlock" xmlns:w16se="http://schemas.microsoft.com/office/word/2015/wordml/symex" xmlns:wpg="http://schemas.microsoft.com/office/word/2010/wordprocessingGroup" xmlns:wpi="http://schemas.microsoft.com/office/word/2010/wordprocessingInk" xmlns:wne="http://schemas.microsoft.com/office/word/2006/wordml" xmlns:wps="http://schemas.microsoft.com/office/word/2010/wordprocessingShape" mc:Ignorable="w14 w15 w16se w16cid w16 w16cex w16sdtdh w16sdtfl w16du wp14">
   <w:p>
     <w:pPr>
@@ -2459,7 +2603,7 @@
 </w:hdr>
 </file>
 
-<file path=word/header20.xml><?xml version="1.0" encoding="utf-8"?>
+<file path=word/header24.xml><?xml version="1.0" encoding="utf-8"?>
 <w:hdr xmlns:wpc="http://schemas.microsoft.com/office/word/2010/wordprocessingCanvas" xmlns:cx="http://schemas.microsoft.com/office/drawing/2014/chartex" xmlns:cx1="http://schemas.microsoft.com/office/drawing/2015/9/8/chartex" xmlns:cx2="http://schemas.microsoft.com/office/drawing/2015/10/21/chartex" xmlns:cx3="http://schemas.microsoft.com/office/drawing/2016/5/9/chartex" xmlns:cx4="http://schemas.microsoft.com/office/drawing/2016/5/10/chartex" xmlns:cx5="http://schemas.microsoft.com/office/drawing/2016/5/11/chartex" xmlns:cx6="http://schemas.microsoft.com/office/drawing/2016/5/12/chartex" xmlns:cx7="http://schemas.microsoft.com/office/drawing/2016/5/13/chartex" xmlns:cx8="http://schemas.microsoft.com/office/drawing/2016/5/14/chartex" xmlns:mc="http://schemas.openxmlformats.org/markup-compatibility/2006" xmlns:aink="http://schemas.microsoft.com/office/drawing/2016/ink" xmlns:am3d="http://schemas.microsoft.com/office/drawing/2017/model3d" xmlns:o="urn:schemas-microsoft-com:office:office" xmlns:oel="http://schemas.microsoft.com/office/2019/extlst" xmlns:r="http://schemas.openxmlformats.org/officeDocument/2006/relationships" xmlns:m="http://schemas.openxmlformats.org/officeDocument/2006/math" xmlns:v="urn:schemas-microsoft-com:vml" xmlns:wp14="http://schemas.microsoft.com/office/word/2010/wordprocessingDrawing" xmlns:wp="http://schemas.openxmlformats.org/drawingml/2006/wordprocessingDrawing" xmlns:w10="urn:schemas-microsoft-com:office:word" xmlns:w="http://schemas.openxmlformats.org/wordprocessingml/2006/main" xmlns:w14="http://schemas.microsoft.com/office/word/2010/wordml" xmlns:w15="http://schemas.microsoft.com/office/word/2012/wordml" xmlns:w16cei="http://schemas.microsoft.com/office/word/2026/wordml/cei" xmlns:w16cex="http://schemas.microsoft.com/office/word/2018/wordml/cex" xmlns:w16cid="http://schemas.microsoft.com/office/word/2016/wordml/cid" xmlns:w16="http://schemas.microsoft.com/office/word/2018/wordml" xmlns:w16du="http://schemas.microsoft.com/office/word/2023/wordml/word16du" xmlns:w16sdtdh="http://schemas.microsoft.com/office/word/2020/wordml/sdtdatahash" xmlns:w16sdtfl="http://schemas.microsoft.com/office/word/2024/wordml/sdtformatlock" xmlns:w16se="http://schemas.microsoft.com/office/word/2015/wordml/symex" xmlns:wpg="http://schemas.microsoft.com/office/word/2010/wordprocessingGroup" xmlns:wpi="http://schemas.microsoft.com/office/word/2010/wordprocessingInk" xmlns:wne="http://schemas.microsoft.com/office/word/2006/wordml" xmlns:wps="http://schemas.microsoft.com/office/word/2010/wordprocessingShape" mc:Ignorable="w14 w15 w16se w16cid w16 w16cex w16sdtdh w16sdtfl w16du wp14">
   <w:p>
     <w:pPr>
@@ -2469,30 +2613,10 @@
     </w:pPr>
     <w:r>
       <w:rPr>
-        <w:b/>
-        <w:bCs/>
         <w:noProof/>
       </w:rPr>
-      <w:t>EENG 385: MOSFET</w:t>
-    </w:r>
-  </w:p>
-</w:hdr>
-</file>
-
-<file path=word/header21.xml><?xml version="1.0" encoding="utf-8"?>
-<w:hdr xmlns:wpc="http://schemas.microsoft.com/office/word/2010/wordprocessingCanvas" xmlns:cx="http://schemas.microsoft.com/office/drawing/2014/chartex" xmlns:cx1="http://schemas.microsoft.com/office/drawing/2015/9/8/chartex" xmlns:cx2="http://schemas.microsoft.com/office/drawing/2015/10/21/chartex" xmlns:cx3="http://schemas.microsoft.com/office/drawing/2016/5/9/chartex" xmlns:cx4="http://schemas.microsoft.com/office/drawing/2016/5/10/chartex" xmlns:cx5="http://schemas.microsoft.com/office/drawing/2016/5/11/chartex" xmlns:cx6="http://schemas.microsoft.com/office/drawing/2016/5/12/chartex" xmlns:cx7="http://schemas.microsoft.com/office/drawing/2016/5/13/chartex" xmlns:cx8="http://schemas.microsoft.com/office/drawing/2016/5/14/chartex" xmlns:mc="http://schemas.openxmlformats.org/markup-compatibility/2006" xmlns:aink="http://schemas.microsoft.com/office/drawing/2016/ink" xmlns:am3d="http://schemas.microsoft.com/office/drawing/2017/model3d" xmlns:o="urn:schemas-microsoft-com:office:office" xmlns:oel="http://schemas.microsoft.com/office/2019/extlst" xmlns:r="http://schemas.openxmlformats.org/officeDocument/2006/relationships" xmlns:m="http://schemas.openxmlformats.org/officeDocument/2006/math" xmlns:v="urn:schemas-microsoft-com:vml" xmlns:wp14="http://schemas.microsoft.com/office/word/2010/wordprocessingDrawing" xmlns:wp="http://schemas.openxmlformats.org/drawingml/2006/wordprocessingDrawing" xmlns:w10="urn:schemas-microsoft-com:office:word" xmlns:w="http://schemas.openxmlformats.org/wordprocessingml/2006/main" xmlns:w14="http://schemas.microsoft.com/office/word/2010/wordml" xmlns:w15="http://schemas.microsoft.com/office/word/2012/wordml" xmlns:w16cei="http://schemas.microsoft.com/office/word/2026/wordml/cei" xmlns:w16cex="http://schemas.microsoft.com/office/word/2018/wordml/cex" xmlns:w16cid="http://schemas.microsoft.com/office/word/2016/wordml/cid" xmlns:w16="http://schemas.microsoft.com/office/word/2018/wordml" xmlns:w16du="http://schemas.microsoft.com/office/word/2023/wordml/word16du" xmlns:w16sdtdh="http://schemas.microsoft.com/office/word/2020/wordml/sdtdatahash" xmlns:w16sdtfl="http://schemas.microsoft.com/office/word/2024/wordml/sdtformatlock" xmlns:w16se="http://schemas.microsoft.com/office/word/2015/wordml/symex" xmlns:wpg="http://schemas.microsoft.com/office/word/2010/wordprocessingGroup" xmlns:wpi="http://schemas.microsoft.com/office/word/2010/wordprocessingInk" xmlns:wne="http://schemas.microsoft.com/office/word/2006/wordml" xmlns:wps="http://schemas.microsoft.com/office/word/2010/wordprocessingShape" mc:Ignorable="w14 w15 w16se w16cid w16 w16cex w16sdtdh w16sdtfl w16du wp14">
-  <w:p>
-    <w:pPr>
-      <w:spacing w:after="0" w:line="259" w:lineRule="auto"/>
-      <w:ind w:left="0" w:right="106" w:firstLine="0"/>
-      <w:jc w:val="right"/>
-    </w:pPr>
-    <w:r>
-      <w:rPr>
-        <w:noProof/>
-      </w:rPr>
       <w:drawing>
-        <wp:anchor distT="0" distB="0" distL="114300" distR="114300" simplePos="0" relativeHeight="251664384" behindDoc="0" locked="0" layoutInCell="1" allowOverlap="0" wp14:anchorId="0AC140D2" wp14:editId="32E06B04">
+        <wp:anchor distT="0" distB="0" distL="114300" distR="114300" simplePos="0" relativeHeight="251669504" behindDoc="0" locked="0" layoutInCell="1" allowOverlap="0" wp14:anchorId="778D0B7F" wp14:editId="78FF010B">
           <wp:simplePos x="0" y="0"/>
           <wp:positionH relativeFrom="page">
             <wp:posOffset>914400</wp:posOffset>
@@ -2571,7 +2695,7 @@
         <w:noProof/>
       </w:rPr>
       <w:drawing>
-        <wp:anchor distT="0" distB="0" distL="114300" distR="114300" simplePos="0" relativeHeight="251652096" behindDoc="0" locked="0" layoutInCell="1" allowOverlap="0" wp14:anchorId="71CA595B" wp14:editId="7AD2EE71">
+        <wp:anchor distT="0" distB="0" distL="114300" distR="114300" simplePos="0" relativeHeight="251651072" behindDoc="0" locked="0" layoutInCell="1" allowOverlap="0" wp14:anchorId="56C3C6CA" wp14:editId="2FAE13AB">
           <wp:simplePos x="0" y="0"/>
           <wp:positionH relativeFrom="page">
             <wp:posOffset>914400</wp:posOffset>
@@ -2635,7 +2759,7 @@
         <w:noProof/>
       </w:rPr>
       <w:drawing>
-        <wp:anchor distT="0" distB="0" distL="114300" distR="114300" simplePos="0" relativeHeight="251653120" behindDoc="0" locked="0" layoutInCell="1" allowOverlap="0" wp14:anchorId="43BBFDE2" wp14:editId="1E07975A">
+        <wp:anchor distT="0" distB="0" distL="114300" distR="114300" simplePos="0" relativeHeight="251652096" behindDoc="0" locked="0" layoutInCell="1" allowOverlap="0" wp14:anchorId="5C565B5C" wp14:editId="77FBB016">
           <wp:simplePos x="0" y="0"/>
           <wp:positionH relativeFrom="page">
             <wp:posOffset>914400</wp:posOffset>
@@ -2735,7 +2859,7 @@
         <w:noProof/>
       </w:rPr>
       <w:drawing>
-        <wp:anchor distT="0" distB="0" distL="114300" distR="114300" simplePos="0" relativeHeight="251654144" behindDoc="0" locked="0" layoutInCell="1" allowOverlap="0" wp14:anchorId="27F48FE6" wp14:editId="6C414092">
+        <wp:anchor distT="0" distB="0" distL="114300" distR="114300" simplePos="0" relativeHeight="251653120" behindDoc="0" locked="0" layoutInCell="1" allowOverlap="0" wp14:anchorId="4291821C" wp14:editId="633942CA">
           <wp:simplePos x="0" y="0"/>
           <wp:positionH relativeFrom="page">
             <wp:posOffset>914400</wp:posOffset>
@@ -2793,7 +2917,7 @@
         <w:noProof/>
       </w:rPr>
       <w:drawing>
-        <wp:anchor distT="0" distB="0" distL="114300" distR="114300" simplePos="0" relativeHeight="251655168" behindDoc="0" locked="0" layoutInCell="1" allowOverlap="0" wp14:anchorId="4BBC559A" wp14:editId="132CC486">
+        <wp:anchor distT="0" distB="0" distL="114300" distR="114300" simplePos="0" relativeHeight="251654144" behindDoc="0" locked="0" layoutInCell="1" allowOverlap="0" wp14:anchorId="7C6007E5" wp14:editId="0B1BCD1D">
           <wp:simplePos x="0" y="0"/>
           <wp:positionH relativeFrom="page">
             <wp:posOffset>914400</wp:posOffset>
@@ -2893,7 +3017,7 @@
         <w:noProof/>
       </w:rPr>
       <w:drawing>
-        <wp:anchor distT="0" distB="0" distL="114300" distR="114300" simplePos="0" relativeHeight="251656192" behindDoc="0" locked="0" layoutInCell="1" allowOverlap="0" wp14:anchorId="3E2A4483" wp14:editId="76932CCE">
+        <wp:anchor distT="0" distB="0" distL="114300" distR="114300" simplePos="0" relativeHeight="251655168" behindDoc="0" locked="0" layoutInCell="1" allowOverlap="0" wp14:anchorId="460FB4C4" wp14:editId="6396A582">
           <wp:simplePos x="0" y="0"/>
           <wp:positionH relativeFrom="page">
             <wp:posOffset>914400</wp:posOffset>
@@ -2941,6 +3065,185 @@
 <file path=word/numbering.xml><?xml version="1.0" encoding="utf-8"?>
 <w:numbering xmlns:wpc="http://schemas.microsoft.com/office/word/2010/wordprocessingCanvas" xmlns:cx="http://schemas.microsoft.com/office/drawing/2014/chartex" xmlns:cx1="http://schemas.microsoft.com/office/drawing/2015/9/8/chartex" xmlns:cx2="http://schemas.microsoft.com/office/drawing/2015/10/21/chartex" xmlns:cx3="http://schemas.microsoft.com/office/drawing/2016/5/9/chartex" xmlns:cx4="http://schemas.microsoft.com/office/drawing/2016/5/10/chartex" xmlns:cx5="http://schemas.microsoft.com/office/drawing/2016/5/11/chartex" xmlns:cx6="http://schemas.microsoft.com/office/drawing/2016/5/12/chartex" xmlns:cx7="http://schemas.microsoft.com/office/drawing/2016/5/13/chartex" xmlns:cx8="http://schemas.microsoft.com/office/drawing/2016/5/14/chartex" xmlns:mc="http://schemas.openxmlformats.org/markup-compatibility/2006" xmlns:aink="http://schemas.microsoft.com/office/drawing/2016/ink" xmlns:am3d="http://schemas.microsoft.com/office/drawing/2017/model3d" xmlns:o="urn:schemas-microsoft-com:office:office" xmlns:oel="http://schemas.microsoft.com/office/2019/extlst" xmlns:r="http://schemas.openxmlformats.org/officeDocument/2006/relationships" xmlns:m="http://schemas.openxmlformats.org/officeDocument/2006/math" xmlns:v="urn:schemas-microsoft-com:vml" xmlns:wp14="http://schemas.microsoft.com/office/word/2010/wordprocessingDrawing" xmlns:wp="http://schemas.openxmlformats.org/drawingml/2006/wordprocessingDrawing" xmlns:w10="urn:schemas-microsoft-com:office:word" xmlns:w="http://schemas.openxmlformats.org/wordprocessingml/2006/main" xmlns:w14="http://schemas.microsoft.com/office/word/2010/wordml" xmlns:w15="http://schemas.microsoft.com/office/word/2012/wordml" xmlns:w16cei="http://schemas.microsoft.com/office/word/2026/wordml/cei" xmlns:w16cex="http://schemas.microsoft.com/office/word/2018/wordml/cex" xmlns:w16cid="http://schemas.microsoft.com/office/word/2016/wordml/cid" xmlns:w16="http://schemas.microsoft.com/office/word/2018/wordml" xmlns:w16du="http://schemas.microsoft.com/office/word/2023/wordml/word16du" xmlns:w16sdtdh="http://schemas.microsoft.com/office/word/2020/wordml/sdtdatahash" xmlns:w16sdtfl="http://schemas.microsoft.com/office/word/2024/wordml/sdtformatlock" xmlns:w16se="http://schemas.microsoft.com/office/word/2015/wordml/symex" xmlns:wpg="http://schemas.microsoft.com/office/word/2010/wordprocessingGroup" xmlns:wpi="http://schemas.microsoft.com/office/word/2010/wordprocessingInk" xmlns:wne="http://schemas.microsoft.com/office/word/2006/wordml" xmlns:wps="http://schemas.microsoft.com/office/word/2010/wordprocessingShape" mc:Ignorable="w14 w15 w16se w16cid w16 w16cex w16sdtdh w16sdtfl w16du wp14">
   <w:abstractNum w:abstractNumId="0" w15:restartNumberingAfterBreak="0">
+    <w:nsid w:val="002F310B"/>
+    <w:multiLevelType w:val="hybridMultilevel"/>
+    <w:tmpl w:val="6B7AA18E"/>
+    <w:lvl w:ilvl="0" w:tplc="FFFFFFFF">
+      <w:start w:val="1"/>
+      <w:numFmt w:val="decimal"/>
+      <w:lvlText w:val="%1."/>
+      <w:lvlJc w:val="left"/>
+      <w:pPr>
+        <w:ind w:left="720" w:hanging="360"/>
+      </w:pPr>
+      <w:rPr>
+        <w:b w:val="0"/>
+        <w:bCs w:val="0"/>
+      </w:rPr>
+    </w:lvl>
+    <w:lvl w:ilvl="1" w:tplc="FFFFFFFF">
+      <w:start w:val="1"/>
+      <w:numFmt w:val="lowerLetter"/>
+      <w:lvlText w:val="%2."/>
+      <w:lvlJc w:val="left"/>
+      <w:pPr>
+        <w:ind w:left="1440" w:hanging="360"/>
+      </w:pPr>
+    </w:lvl>
+    <w:lvl w:ilvl="2" w:tplc="FFFFFFFF">
+      <w:start w:val="1"/>
+      <w:numFmt w:val="lowerRoman"/>
+      <w:lvlText w:val="%3."/>
+      <w:lvlJc w:val="right"/>
+      <w:pPr>
+        <w:ind w:left="2160" w:hanging="180"/>
+      </w:pPr>
+    </w:lvl>
+    <w:lvl w:ilvl="3" w:tplc="FFFFFFFF">
+      <w:start w:val="1"/>
+      <w:numFmt w:val="decimal"/>
+      <w:lvlText w:val="%4."/>
+      <w:lvlJc w:val="left"/>
+      <w:pPr>
+        <w:ind w:left="2880" w:hanging="360"/>
+      </w:pPr>
+    </w:lvl>
+    <w:lvl w:ilvl="4" w:tplc="FFFFFFFF">
+      <w:start w:val="1"/>
+      <w:numFmt w:val="lowerLetter"/>
+      <w:lvlText w:val="%5."/>
+      <w:lvlJc w:val="left"/>
+      <w:pPr>
+        <w:ind w:left="3600" w:hanging="360"/>
+      </w:pPr>
+    </w:lvl>
+    <w:lvl w:ilvl="5" w:tplc="FFFFFFFF">
+      <w:start w:val="1"/>
+      <w:numFmt w:val="lowerRoman"/>
+      <w:lvlText w:val="%6."/>
+      <w:lvlJc w:val="right"/>
+      <w:pPr>
+        <w:ind w:left="4320" w:hanging="180"/>
+      </w:pPr>
+    </w:lvl>
+    <w:lvl w:ilvl="6" w:tplc="FFFFFFFF">
+      <w:start w:val="1"/>
+      <w:numFmt w:val="decimal"/>
+      <w:lvlText w:val="%7."/>
+      <w:lvlJc w:val="left"/>
+      <w:pPr>
+        <w:ind w:left="5040" w:hanging="360"/>
+      </w:pPr>
+    </w:lvl>
+    <w:lvl w:ilvl="7" w:tplc="FFFFFFFF">
+      <w:start w:val="1"/>
+      <w:numFmt w:val="lowerLetter"/>
+      <w:lvlText w:val="%8."/>
+      <w:lvlJc w:val="left"/>
+      <w:pPr>
+        <w:ind w:left="5760" w:hanging="360"/>
+      </w:pPr>
+    </w:lvl>
+    <w:lvl w:ilvl="8" w:tplc="FFFFFFFF">
+      <w:start w:val="1"/>
+      <w:numFmt w:val="lowerRoman"/>
+      <w:lvlText w:val="%9."/>
+      <w:lvlJc w:val="right"/>
+      <w:pPr>
+        <w:ind w:left="6480" w:hanging="180"/>
+      </w:pPr>
+    </w:lvl>
+  </w:abstractNum>
+  <w:abstractNum w:abstractNumId="1" w15:restartNumberingAfterBreak="0">
+    <w:nsid w:val="01A30456"/>
+    <w:multiLevelType w:val="hybridMultilevel"/>
+    <w:tmpl w:val="82129256"/>
+    <w:lvl w:ilvl="0" w:tplc="04090011">
+      <w:start w:val="1"/>
+      <w:numFmt w:val="decimal"/>
+      <w:lvlText w:val="%1)"/>
+      <w:lvlJc w:val="left"/>
+      <w:pPr>
+        <w:ind w:left="720" w:hanging="360"/>
+      </w:pPr>
+      <w:rPr>
+        <w:rFonts w:hint="default"/>
+      </w:rPr>
+    </w:lvl>
+    <w:lvl w:ilvl="1" w:tplc="04090019" w:tentative="1">
+      <w:start w:val="1"/>
+      <w:numFmt w:val="lowerLetter"/>
+      <w:lvlText w:val="%2."/>
+      <w:lvlJc w:val="left"/>
+      <w:pPr>
+        <w:ind w:left="1440" w:hanging="360"/>
+      </w:pPr>
+    </w:lvl>
+    <w:lvl w:ilvl="2" w:tplc="0409001B" w:tentative="1">
+      <w:start w:val="1"/>
+      <w:numFmt w:val="lowerRoman"/>
+      <w:lvlText w:val="%3."/>
+      <w:lvlJc w:val="right"/>
+      <w:pPr>
+        <w:ind w:left="2160" w:hanging="180"/>
+      </w:pPr>
+    </w:lvl>
+    <w:lvl w:ilvl="3" w:tplc="0409000F" w:tentative="1">
+      <w:start w:val="1"/>
+      <w:numFmt w:val="decimal"/>
+      <w:lvlText w:val="%4."/>
+      <w:lvlJc w:val="left"/>
+      <w:pPr>
+        <w:ind w:left="2880" w:hanging="360"/>
+      </w:pPr>
+    </w:lvl>
+    <w:lvl w:ilvl="4" w:tplc="04090019" w:tentative="1">
+      <w:start w:val="1"/>
+      <w:numFmt w:val="lowerLetter"/>
+      <w:lvlText w:val="%5."/>
+      <w:lvlJc w:val="left"/>
+      <w:pPr>
+        <w:ind w:left="3600" w:hanging="360"/>
+      </w:pPr>
+    </w:lvl>
+    <w:lvl w:ilvl="5" w:tplc="0409001B" w:tentative="1">
+      <w:start w:val="1"/>
+      <w:numFmt w:val="lowerRoman"/>
+      <w:lvlText w:val="%6."/>
+      <w:lvlJc w:val="right"/>
+      <w:pPr>
+        <w:ind w:left="4320" w:hanging="180"/>
+      </w:pPr>
+    </w:lvl>
+    <w:lvl w:ilvl="6" w:tplc="0409000F" w:tentative="1">
+      <w:start w:val="1"/>
+      <w:numFmt w:val="decimal"/>
+      <w:lvlText w:val="%7."/>
+      <w:lvlJc w:val="left"/>
+      <w:pPr>
+        <w:ind w:left="5040" w:hanging="360"/>
+      </w:pPr>
+    </w:lvl>
+    <w:lvl w:ilvl="7" w:tplc="04090019" w:tentative="1">
+      <w:start w:val="1"/>
+      <w:numFmt w:val="lowerLetter"/>
+      <w:lvlText w:val="%8."/>
+      <w:lvlJc w:val="left"/>
+      <w:pPr>
+        <w:ind w:left="5760" w:hanging="360"/>
+      </w:pPr>
+    </w:lvl>
+    <w:lvl w:ilvl="8" w:tplc="0409001B" w:tentative="1">
+      <w:start w:val="1"/>
+      <w:numFmt w:val="lowerRoman"/>
+      <w:lvlText w:val="%9."/>
+      <w:lvlJc w:val="right"/>
+      <w:pPr>
+        <w:ind w:left="6480" w:hanging="180"/>
+      </w:pPr>
+    </w:lvl>
+  </w:abstractNum>
+  <w:abstractNum w:abstractNumId="2" w15:restartNumberingAfterBreak="0">
     <w:nsid w:val="05705B2D"/>
     <w:multiLevelType w:val="hybridMultilevel"/>
     <w:tmpl w:val="F1DC2776"/>
@@ -3034,7 +3337,7 @@
       </w:pPr>
     </w:lvl>
   </w:abstractNum>
-  <w:abstractNum w:abstractNumId="1" w15:restartNumberingAfterBreak="0">
+  <w:abstractNum w:abstractNumId="3" w15:restartNumberingAfterBreak="0">
     <w:nsid w:val="0827704A"/>
     <w:multiLevelType w:val="hybridMultilevel"/>
     <w:tmpl w:val="67103216"/>
@@ -3123,7 +3426,7 @@
       </w:pPr>
     </w:lvl>
   </w:abstractNum>
-  <w:abstractNum w:abstractNumId="2" w15:restartNumberingAfterBreak="0">
+  <w:abstractNum w:abstractNumId="4" w15:restartNumberingAfterBreak="0">
     <w:nsid w:val="0A1D2488"/>
     <w:multiLevelType w:val="hybridMultilevel"/>
     <w:tmpl w:val="9EA2438A"/>
@@ -3212,7 +3515,7 @@
       </w:pPr>
     </w:lvl>
   </w:abstractNum>
-  <w:abstractNum w:abstractNumId="3" w15:restartNumberingAfterBreak="0">
+  <w:abstractNum w:abstractNumId="5" w15:restartNumberingAfterBreak="0">
     <w:nsid w:val="0AC31089"/>
     <w:multiLevelType w:val="hybridMultilevel"/>
     <w:tmpl w:val="AC12D9EA"/>
@@ -3301,7 +3604,7 @@
       </w:pPr>
     </w:lvl>
   </w:abstractNum>
-  <w:abstractNum w:abstractNumId="4" w15:restartNumberingAfterBreak="0">
+  <w:abstractNum w:abstractNumId="6" w15:restartNumberingAfterBreak="0">
     <w:nsid w:val="0AD8330F"/>
     <w:multiLevelType w:val="hybridMultilevel"/>
     <w:tmpl w:val="DF5EBC2E"/>
@@ -3390,7 +3693,7 @@
       </w:pPr>
     </w:lvl>
   </w:abstractNum>
-  <w:abstractNum w:abstractNumId="5" w15:restartNumberingAfterBreak="0">
+  <w:abstractNum w:abstractNumId="7" w15:restartNumberingAfterBreak="0">
     <w:nsid w:val="0B834B30"/>
     <w:multiLevelType w:val="hybridMultilevel"/>
     <w:tmpl w:val="718CA902"/>
@@ -3479,7 +3782,7 @@
       </w:pPr>
     </w:lvl>
   </w:abstractNum>
-  <w:abstractNum w:abstractNumId="6" w15:restartNumberingAfterBreak="0">
+  <w:abstractNum w:abstractNumId="8" w15:restartNumberingAfterBreak="0">
     <w:nsid w:val="0DD67AAF"/>
     <w:multiLevelType w:val="hybridMultilevel"/>
     <w:tmpl w:val="5E74FA64"/>
@@ -3593,7 +3896,119 @@
       </w:rPr>
     </w:lvl>
   </w:abstractNum>
-  <w:abstractNum w:abstractNumId="7" w15:restartNumberingAfterBreak="0">
+  <w:abstractNum w:abstractNumId="9" w15:restartNumberingAfterBreak="0">
+    <w:nsid w:val="0F8A457C"/>
+    <w:multiLevelType w:val="hybridMultilevel"/>
+    <w:tmpl w:val="B2FE4784"/>
+    <w:lvl w:ilvl="0" w:tplc="ECDAFEBA">
+      <w:numFmt w:val="bullet"/>
+      <w:lvlText w:val=""/>
+      <w:lvlJc w:val="left"/>
+      <w:pPr>
+        <w:ind w:left="720" w:hanging="360"/>
+      </w:pPr>
+      <w:rPr>
+        <w:rFonts w:ascii="Symbol" w:eastAsia="Cambria" w:hAnsi="Symbol" w:cs="Cambria" w:hint="default"/>
+      </w:rPr>
+    </w:lvl>
+    <w:lvl w:ilvl="1" w:tplc="04090003" w:tentative="1">
+      <w:start w:val="1"/>
+      <w:numFmt w:val="bullet"/>
+      <w:lvlText w:val="o"/>
+      <w:lvlJc w:val="left"/>
+      <w:pPr>
+        <w:ind w:left="1440" w:hanging="360"/>
+      </w:pPr>
+      <w:rPr>
+        <w:rFonts w:ascii="Courier New" w:hAnsi="Courier New" w:cs="Courier New" w:hint="default"/>
+      </w:rPr>
+    </w:lvl>
+    <w:lvl w:ilvl="2" w:tplc="04090005" w:tentative="1">
+      <w:start w:val="1"/>
+      <w:numFmt w:val="bullet"/>
+      <w:lvlText w:val=""/>
+      <w:lvlJc w:val="left"/>
+      <w:pPr>
+        <w:ind w:left="2160" w:hanging="360"/>
+      </w:pPr>
+      <w:rPr>
+        <w:rFonts w:ascii="Wingdings" w:hAnsi="Wingdings" w:hint="default"/>
+      </w:rPr>
+    </w:lvl>
+    <w:lvl w:ilvl="3" w:tplc="04090001" w:tentative="1">
+      <w:start w:val="1"/>
+      <w:numFmt w:val="bullet"/>
+      <w:lvlText w:val=""/>
+      <w:lvlJc w:val="left"/>
+      <w:pPr>
+        <w:ind w:left="2880" w:hanging="360"/>
+      </w:pPr>
+      <w:rPr>
+        <w:rFonts w:ascii="Symbol" w:hAnsi="Symbol" w:hint="default"/>
+      </w:rPr>
+    </w:lvl>
+    <w:lvl w:ilvl="4" w:tplc="04090003" w:tentative="1">
+      <w:start w:val="1"/>
+      <w:numFmt w:val="bullet"/>
+      <w:lvlText w:val="o"/>
+      <w:lvlJc w:val="left"/>
+      <w:pPr>
+        <w:ind w:left="3600" w:hanging="360"/>
+      </w:pPr>
+      <w:rPr>
+        <w:rFonts w:ascii="Courier New" w:hAnsi="Courier New" w:cs="Courier New" w:hint="default"/>
+      </w:rPr>
+    </w:lvl>
+    <w:lvl w:ilvl="5" w:tplc="04090005" w:tentative="1">
+      <w:start w:val="1"/>
+      <w:numFmt w:val="bullet"/>
+      <w:lvlText w:val=""/>
+      <w:lvlJc w:val="left"/>
+      <w:pPr>
+        <w:ind w:left="4320" w:hanging="360"/>
+      </w:pPr>
+      <w:rPr>
+        <w:rFonts w:ascii="Wingdings" w:hAnsi="Wingdings" w:hint="default"/>
+      </w:rPr>
+    </w:lvl>
+    <w:lvl w:ilvl="6" w:tplc="04090001" w:tentative="1">
+      <w:start w:val="1"/>
+      <w:numFmt w:val="bullet"/>
+      <w:lvlText w:val=""/>
+      <w:lvlJc w:val="left"/>
+      <w:pPr>
+        <w:ind w:left="5040" w:hanging="360"/>
+      </w:pPr>
+      <w:rPr>
+        <w:rFonts w:ascii="Symbol" w:hAnsi="Symbol" w:hint="default"/>
+      </w:rPr>
+    </w:lvl>
+    <w:lvl w:ilvl="7" w:tplc="04090003" w:tentative="1">
+      <w:start w:val="1"/>
+      <w:numFmt w:val="bullet"/>
+      <w:lvlText w:val="o"/>
+      <w:lvlJc w:val="left"/>
+      <w:pPr>
+        <w:ind w:left="5760" w:hanging="360"/>
+      </w:pPr>
+      <w:rPr>
+        <w:rFonts w:ascii="Courier New" w:hAnsi="Courier New" w:cs="Courier New" w:hint="default"/>
+      </w:rPr>
+    </w:lvl>
+    <w:lvl w:ilvl="8" w:tplc="04090005" w:tentative="1">
+      <w:start w:val="1"/>
+      <w:numFmt w:val="bullet"/>
+      <w:lvlText w:val=""/>
+      <w:lvlJc w:val="left"/>
+      <w:pPr>
+        <w:ind w:left="6480" w:hanging="360"/>
+      </w:pPr>
+      <w:rPr>
+        <w:rFonts w:ascii="Wingdings" w:hAnsi="Wingdings" w:hint="default"/>
+      </w:rPr>
+    </w:lvl>
+  </w:abstractNum>
+  <w:abstractNum w:abstractNumId="10" w15:restartNumberingAfterBreak="0">
     <w:nsid w:val="10327972"/>
     <w:multiLevelType w:val="hybridMultilevel"/>
     <w:tmpl w:val="1B26D4AC"/>
@@ -3684,7 +4099,7 @@
       </w:pPr>
     </w:lvl>
   </w:abstractNum>
-  <w:abstractNum w:abstractNumId="8" w15:restartNumberingAfterBreak="0">
+  <w:abstractNum w:abstractNumId="11" w15:restartNumberingAfterBreak="0">
     <w:nsid w:val="12B6163A"/>
     <w:multiLevelType w:val="hybridMultilevel"/>
     <w:tmpl w:val="1AEE7134"/>
@@ -3773,7 +4188,96 @@
       </w:pPr>
     </w:lvl>
   </w:abstractNum>
-  <w:abstractNum w:abstractNumId="9" w15:restartNumberingAfterBreak="0">
+  <w:abstractNum w:abstractNumId="12" w15:restartNumberingAfterBreak="0">
+    <w:nsid w:val="16BB4B3F"/>
+    <w:multiLevelType w:val="hybridMultilevel"/>
+    <w:tmpl w:val="8CD8A008"/>
+    <w:lvl w:ilvl="0" w:tplc="0409000F">
+      <w:start w:val="1"/>
+      <w:numFmt w:val="decimal"/>
+      <w:lvlText w:val="%1."/>
+      <w:lvlJc w:val="left"/>
+      <w:pPr>
+        <w:ind w:left="720" w:hanging="360"/>
+      </w:pPr>
+      <w:rPr>
+        <w:rFonts w:hint="default"/>
+      </w:rPr>
+    </w:lvl>
+    <w:lvl w:ilvl="1" w:tplc="04090019" w:tentative="1">
+      <w:start w:val="1"/>
+      <w:numFmt w:val="lowerLetter"/>
+      <w:lvlText w:val="%2."/>
+      <w:lvlJc w:val="left"/>
+      <w:pPr>
+        <w:ind w:left="1440" w:hanging="360"/>
+      </w:pPr>
+    </w:lvl>
+    <w:lvl w:ilvl="2" w:tplc="0409001B" w:tentative="1">
+      <w:start w:val="1"/>
+      <w:numFmt w:val="lowerRoman"/>
+      <w:lvlText w:val="%3."/>
+      <w:lvlJc w:val="right"/>
+      <w:pPr>
+        <w:ind w:left="2160" w:hanging="180"/>
+      </w:pPr>
+    </w:lvl>
+    <w:lvl w:ilvl="3" w:tplc="0409000F" w:tentative="1">
+      <w:start w:val="1"/>
+      <w:numFmt w:val="decimal"/>
+      <w:lvlText w:val="%4."/>
+      <w:lvlJc w:val="left"/>
+      <w:pPr>
+        <w:ind w:left="2880" w:hanging="360"/>
+      </w:pPr>
+    </w:lvl>
+    <w:lvl w:ilvl="4" w:tplc="04090019" w:tentative="1">
+      <w:start w:val="1"/>
+      <w:numFmt w:val="lowerLetter"/>
+      <w:lvlText w:val="%5."/>
+      <w:lvlJc w:val="left"/>
+      <w:pPr>
+        <w:ind w:left="3600" w:hanging="360"/>
+      </w:pPr>
+    </w:lvl>
+    <w:lvl w:ilvl="5" w:tplc="0409001B" w:tentative="1">
+      <w:start w:val="1"/>
+      <w:numFmt w:val="lowerRoman"/>
+      <w:lvlText w:val="%6."/>
+      <w:lvlJc w:val="right"/>
+      <w:pPr>
+        <w:ind w:left="4320" w:hanging="180"/>
+      </w:pPr>
+    </w:lvl>
+    <w:lvl w:ilvl="6" w:tplc="0409000F" w:tentative="1">
+      <w:start w:val="1"/>
+      <w:numFmt w:val="decimal"/>
+      <w:lvlText w:val="%7."/>
+      <w:lvlJc w:val="left"/>
+      <w:pPr>
+        <w:ind w:left="5040" w:hanging="360"/>
+      </w:pPr>
+    </w:lvl>
+    <w:lvl w:ilvl="7" w:tplc="04090019" w:tentative="1">
+      <w:start w:val="1"/>
+      <w:numFmt w:val="lowerLetter"/>
+      <w:lvlText w:val="%8."/>
+      <w:lvlJc w:val="left"/>
+      <w:pPr>
+        <w:ind w:left="5760" w:hanging="360"/>
+      </w:pPr>
+    </w:lvl>
+    <w:lvl w:ilvl="8" w:tplc="0409001B" w:tentative="1">
+      <w:start w:val="1"/>
+      <w:numFmt w:val="lowerRoman"/>
+      <w:lvlText w:val="%9."/>
+      <w:lvlJc w:val="right"/>
+      <w:pPr>
+        <w:ind w:left="6480" w:hanging="180"/>
+      </w:pPr>
+    </w:lvl>
+  </w:abstractNum>
+  <w:abstractNum w:abstractNumId="13" w15:restartNumberingAfterBreak="0">
     <w:nsid w:val="2439542A"/>
     <w:multiLevelType w:val="hybridMultilevel"/>
     <w:tmpl w:val="A2BA338A"/>
@@ -3886,7 +4390,7 @@
       </w:rPr>
     </w:lvl>
   </w:abstractNum>
-  <w:abstractNum w:abstractNumId="10" w15:restartNumberingAfterBreak="0">
+  <w:abstractNum w:abstractNumId="14" w15:restartNumberingAfterBreak="0">
     <w:nsid w:val="30DC2E34"/>
     <w:multiLevelType w:val="hybridMultilevel"/>
     <w:tmpl w:val="7C9AA290"/>
@@ -3975,7 +4479,7 @@
       </w:pPr>
     </w:lvl>
   </w:abstractNum>
-  <w:abstractNum w:abstractNumId="11" w15:restartNumberingAfterBreak="0">
+  <w:abstractNum w:abstractNumId="15" w15:restartNumberingAfterBreak="0">
     <w:nsid w:val="3803790C"/>
     <w:multiLevelType w:val="hybridMultilevel"/>
     <w:tmpl w:val="6BD66D92"/>
@@ -4087,7 +4591,7 @@
       </w:rPr>
     </w:lvl>
   </w:abstractNum>
-  <w:abstractNum w:abstractNumId="12" w15:restartNumberingAfterBreak="0">
+  <w:abstractNum w:abstractNumId="16" w15:restartNumberingAfterBreak="0">
     <w:nsid w:val="39C75216"/>
     <w:multiLevelType w:val="hybridMultilevel"/>
     <w:tmpl w:val="1AEE7134"/>
@@ -4176,7 +4680,7 @@
       </w:pPr>
     </w:lvl>
   </w:abstractNum>
-  <w:abstractNum w:abstractNumId="13" w15:restartNumberingAfterBreak="0">
+  <w:abstractNum w:abstractNumId="17" w15:restartNumberingAfterBreak="0">
     <w:nsid w:val="443852C8"/>
     <w:multiLevelType w:val="hybridMultilevel"/>
     <w:tmpl w:val="7DF8F5F8"/>
@@ -4267,7 +4771,120 @@
       </w:pPr>
     </w:lvl>
   </w:abstractNum>
-  <w:abstractNum w:abstractNumId="14" w15:restartNumberingAfterBreak="0">
+  <w:abstractNum w:abstractNumId="18" w15:restartNumberingAfterBreak="0">
+    <w:nsid w:val="4D03303E"/>
+    <w:multiLevelType w:val="hybridMultilevel"/>
+    <w:tmpl w:val="EAD8009C"/>
+    <w:lvl w:ilvl="0" w:tplc="04090001">
+      <w:start w:val="1"/>
+      <w:numFmt w:val="bullet"/>
+      <w:lvlText w:val=""/>
+      <w:lvlJc w:val="left"/>
+      <w:pPr>
+        <w:ind w:left="720" w:hanging="360"/>
+      </w:pPr>
+      <w:rPr>
+        <w:rFonts w:ascii="Symbol" w:hAnsi="Symbol" w:hint="default"/>
+      </w:rPr>
+    </w:lvl>
+    <w:lvl w:ilvl="1" w:tplc="04090003" w:tentative="1">
+      <w:start w:val="1"/>
+      <w:numFmt w:val="bullet"/>
+      <w:lvlText w:val="o"/>
+      <w:lvlJc w:val="left"/>
+      <w:pPr>
+        <w:ind w:left="1440" w:hanging="360"/>
+      </w:pPr>
+      <w:rPr>
+        <w:rFonts w:ascii="Courier New" w:hAnsi="Courier New" w:cs="Courier New" w:hint="default"/>
+      </w:rPr>
+    </w:lvl>
+    <w:lvl w:ilvl="2" w:tplc="04090005" w:tentative="1">
+      <w:start w:val="1"/>
+      <w:numFmt w:val="bullet"/>
+      <w:lvlText w:val=""/>
+      <w:lvlJc w:val="left"/>
+      <w:pPr>
+        <w:ind w:left="2160" w:hanging="360"/>
+      </w:pPr>
+      <w:rPr>
+        <w:rFonts w:ascii="Wingdings" w:hAnsi="Wingdings" w:hint="default"/>
+      </w:rPr>
+    </w:lvl>
+    <w:lvl w:ilvl="3" w:tplc="04090001" w:tentative="1">
+      <w:start w:val="1"/>
+      <w:numFmt w:val="bullet"/>
+      <w:lvlText w:val=""/>
+      <w:lvlJc w:val="left"/>
+      <w:pPr>
+        <w:ind w:left="2880" w:hanging="360"/>
+      </w:pPr>
+      <w:rPr>
+        <w:rFonts w:ascii="Symbol" w:hAnsi="Symbol" w:hint="default"/>
+      </w:rPr>
+    </w:lvl>
+    <w:lvl w:ilvl="4" w:tplc="04090003" w:tentative="1">
+      <w:start w:val="1"/>
+      <w:numFmt w:val="bullet"/>
+      <w:lvlText w:val="o"/>
+      <w:lvlJc w:val="left"/>
+      <w:pPr>
+        <w:ind w:left="3600" w:hanging="360"/>
+      </w:pPr>
+      <w:rPr>
+        <w:rFonts w:ascii="Courier New" w:hAnsi="Courier New" w:cs="Courier New" w:hint="default"/>
+      </w:rPr>
+    </w:lvl>
+    <w:lvl w:ilvl="5" w:tplc="04090005" w:tentative="1">
+      <w:start w:val="1"/>
+      <w:numFmt w:val="bullet"/>
+      <w:lvlText w:val=""/>
+      <w:lvlJc w:val="left"/>
+      <w:pPr>
+        <w:ind w:left="4320" w:hanging="360"/>
+      </w:pPr>
+      <w:rPr>
+        <w:rFonts w:ascii="Wingdings" w:hAnsi="Wingdings" w:hint="default"/>
+      </w:rPr>
+    </w:lvl>
+    <w:lvl w:ilvl="6" w:tplc="04090001" w:tentative="1">
+      <w:start w:val="1"/>
+      <w:numFmt w:val="bullet"/>
+      <w:lvlText w:val=""/>
+      <w:lvlJc w:val="left"/>
+      <w:pPr>
+        <w:ind w:left="5040" w:hanging="360"/>
+      </w:pPr>
+      <w:rPr>
+        <w:rFonts w:ascii="Symbol" w:hAnsi="Symbol" w:hint="default"/>
+      </w:rPr>
+    </w:lvl>
+    <w:lvl w:ilvl="7" w:tplc="04090003" w:tentative="1">
+      <w:start w:val="1"/>
+      <w:numFmt w:val="bullet"/>
+      <w:lvlText w:val="o"/>
+      <w:lvlJc w:val="left"/>
+      <w:pPr>
+        <w:ind w:left="5760" w:hanging="360"/>
+      </w:pPr>
+      <w:rPr>
+        <w:rFonts w:ascii="Courier New" w:hAnsi="Courier New" w:cs="Courier New" w:hint="default"/>
+      </w:rPr>
+    </w:lvl>
+    <w:lvl w:ilvl="8" w:tplc="04090005" w:tentative="1">
+      <w:start w:val="1"/>
+      <w:numFmt w:val="bullet"/>
+      <w:lvlText w:val=""/>
+      <w:lvlJc w:val="left"/>
+      <w:pPr>
+        <w:ind w:left="6480" w:hanging="360"/>
+      </w:pPr>
+      <w:rPr>
+        <w:rFonts w:ascii="Wingdings" w:hAnsi="Wingdings" w:hint="default"/>
+      </w:rPr>
+    </w:lvl>
+  </w:abstractNum>
+  <w:abstractNum w:abstractNumId="19" w15:restartNumberingAfterBreak="0">
     <w:nsid w:val="52D043D9"/>
     <w:multiLevelType w:val="hybridMultilevel"/>
     <w:tmpl w:val="6B7AA18E"/>
@@ -4357,7 +4974,7 @@
       </w:pPr>
     </w:lvl>
   </w:abstractNum>
-  <w:abstractNum w:abstractNumId="15" w15:restartNumberingAfterBreak="0">
+  <w:abstractNum w:abstractNumId="20" w15:restartNumberingAfterBreak="0">
     <w:nsid w:val="53081027"/>
     <w:multiLevelType w:val="hybridMultilevel"/>
     <w:tmpl w:val="EA823FF4"/>
@@ -4446,7 +5063,7 @@
       </w:pPr>
     </w:lvl>
   </w:abstractNum>
-  <w:abstractNum w:abstractNumId="16" w15:restartNumberingAfterBreak="0">
+  <w:abstractNum w:abstractNumId="21" w15:restartNumberingAfterBreak="0">
     <w:nsid w:val="5FB73A39"/>
     <w:multiLevelType w:val="hybridMultilevel"/>
     <w:tmpl w:val="FF3C5F7A"/>
@@ -4558,7 +5175,7 @@
       </w:rPr>
     </w:lvl>
   </w:abstractNum>
-  <w:abstractNum w:abstractNumId="17" w15:restartNumberingAfterBreak="0">
+  <w:abstractNum w:abstractNumId="22" w15:restartNumberingAfterBreak="0">
     <w:nsid w:val="6D6C1791"/>
     <w:multiLevelType w:val="hybridMultilevel"/>
     <w:tmpl w:val="3EDE184E"/>
@@ -4653,7 +5270,7 @@
       </w:pPr>
     </w:lvl>
   </w:abstractNum>
-  <w:abstractNum w:abstractNumId="18" w15:restartNumberingAfterBreak="0">
+  <w:abstractNum w:abstractNumId="23" w15:restartNumberingAfterBreak="0">
     <w:nsid w:val="6F19680E"/>
     <w:multiLevelType w:val="hybridMultilevel"/>
     <w:tmpl w:val="275C5D88"/>
@@ -4742,7 +5359,7 @@
       </w:pPr>
     </w:lvl>
   </w:abstractNum>
-  <w:abstractNum w:abstractNumId="19" w15:restartNumberingAfterBreak="0">
+  <w:abstractNum w:abstractNumId="24" w15:restartNumberingAfterBreak="0">
     <w:nsid w:val="7031666F"/>
     <w:multiLevelType w:val="hybridMultilevel"/>
     <w:tmpl w:val="7DF8F5F8"/>
@@ -4833,7 +5450,7 @@
       </w:pPr>
     </w:lvl>
   </w:abstractNum>
-  <w:abstractNum w:abstractNumId="20" w15:restartNumberingAfterBreak="0">
+  <w:abstractNum w:abstractNumId="25" w15:restartNumberingAfterBreak="0">
     <w:nsid w:val="7A253C68"/>
     <w:multiLevelType w:val="hybridMultilevel"/>
     <w:tmpl w:val="7DF8F5F8"/>
@@ -4924,7 +5541,7 @@
       </w:pPr>
     </w:lvl>
   </w:abstractNum>
-  <w:abstractNum w:abstractNumId="21" w15:restartNumberingAfterBreak="0">
+  <w:abstractNum w:abstractNumId="26" w15:restartNumberingAfterBreak="0">
     <w:nsid w:val="7CE82962"/>
     <w:multiLevelType w:val="hybridMultilevel"/>
     <w:tmpl w:val="381288A4"/>
@@ -5037,46 +5654,46 @@
     </w:lvl>
   </w:abstractNum>
   <w:num w:numId="1" w16cid:durableId="1298342219">
+    <w:abstractNumId w:val="21"/>
+  </w:num>
+  <w:num w:numId="2" w16cid:durableId="1147550810">
+    <w:abstractNumId w:val="8"/>
+  </w:num>
+  <w:num w:numId="3" w16cid:durableId="1157066370">
+    <w:abstractNumId w:val="14"/>
+  </w:num>
+  <w:num w:numId="4" w16cid:durableId="1833334739">
+    <w:abstractNumId w:val="3"/>
+  </w:num>
+  <w:num w:numId="5" w16cid:durableId="1479347731">
+    <w:abstractNumId w:val="23"/>
+  </w:num>
+  <w:num w:numId="6" w16cid:durableId="1398282445">
+    <w:abstractNumId w:val="7"/>
+  </w:num>
+  <w:num w:numId="7" w16cid:durableId="34892617">
+    <w:abstractNumId w:val="13"/>
+  </w:num>
+  <w:num w:numId="8" w16cid:durableId="854341745">
+    <w:abstractNumId w:val="20"/>
+  </w:num>
+  <w:num w:numId="9" w16cid:durableId="1388531061">
+    <w:abstractNumId w:val="4"/>
+  </w:num>
+  <w:num w:numId="10" w16cid:durableId="235673217">
+    <w:abstractNumId w:val="11"/>
+  </w:num>
+  <w:num w:numId="11" w16cid:durableId="1877891204">
     <w:abstractNumId w:val="16"/>
   </w:num>
-  <w:num w:numId="2" w16cid:durableId="1147550810">
+  <w:num w:numId="12" w16cid:durableId="33970787">
+    <w:abstractNumId w:val="5"/>
+  </w:num>
+  <w:num w:numId="13" w16cid:durableId="211305981">
     <w:abstractNumId w:val="6"/>
   </w:num>
-  <w:num w:numId="3" w16cid:durableId="1157066370">
-    <w:abstractNumId w:val="10"/>
-  </w:num>
-  <w:num w:numId="4" w16cid:durableId="1833334739">
-    <w:abstractNumId w:val="1"/>
-  </w:num>
-  <w:num w:numId="5" w16cid:durableId="1479347731">
-    <w:abstractNumId w:val="18"/>
-  </w:num>
-  <w:num w:numId="6" w16cid:durableId="1398282445">
-    <w:abstractNumId w:val="5"/>
-  </w:num>
-  <w:num w:numId="7" w16cid:durableId="34892617">
-    <w:abstractNumId w:val="9"/>
-  </w:num>
-  <w:num w:numId="8" w16cid:durableId="854341745">
-    <w:abstractNumId w:val="15"/>
-  </w:num>
-  <w:num w:numId="9" w16cid:durableId="1388531061">
-    <w:abstractNumId w:val="2"/>
-  </w:num>
-  <w:num w:numId="10" w16cid:durableId="235673217">
-    <w:abstractNumId w:val="8"/>
-  </w:num>
-  <w:num w:numId="11" w16cid:durableId="1877891204">
-    <w:abstractNumId w:val="12"/>
-  </w:num>
-  <w:num w:numId="12" w16cid:durableId="33970787">
-    <w:abstractNumId w:val="3"/>
-  </w:num>
-  <w:num w:numId="13" w16cid:durableId="211305981">
-    <w:abstractNumId w:val="4"/>
-  </w:num>
   <w:num w:numId="14" w16cid:durableId="589778059">
-    <w:abstractNumId w:val="14"/>
+    <w:abstractNumId w:val="19"/>
     <w:lvlOverride w:ilvl="0">
       <w:startOverride w:val="1"/>
     </w:lvlOverride>
@@ -5106,28 +5723,70 @@
     </w:lvlOverride>
   </w:num>
   <w:num w:numId="15" w16cid:durableId="1641299729">
-    <w:abstractNumId w:val="7"/>
+    <w:abstractNumId w:val="10"/>
   </w:num>
   <w:num w:numId="16" w16cid:durableId="1273634514">
-    <w:abstractNumId w:val="11"/>
+    <w:abstractNumId w:val="15"/>
   </w:num>
   <w:num w:numId="17" w16cid:durableId="671370106">
-    <w:abstractNumId w:val="20"/>
+    <w:abstractNumId w:val="25"/>
   </w:num>
   <w:num w:numId="18" w16cid:durableId="2013142128">
-    <w:abstractNumId w:val="19"/>
+    <w:abstractNumId w:val="24"/>
   </w:num>
   <w:num w:numId="19" w16cid:durableId="2086142381">
-    <w:abstractNumId w:val="13"/>
+    <w:abstractNumId w:val="17"/>
   </w:num>
   <w:num w:numId="20" w16cid:durableId="1252474113">
-    <w:abstractNumId w:val="21"/>
+    <w:abstractNumId w:val="26"/>
   </w:num>
   <w:num w:numId="21" w16cid:durableId="1580938887">
-    <w:abstractNumId w:val="17"/>
+    <w:abstractNumId w:val="22"/>
   </w:num>
   <w:num w:numId="22" w16cid:durableId="327094648">
+    <w:abstractNumId w:val="2"/>
+  </w:num>
+  <w:num w:numId="23" w16cid:durableId="2066101214">
+    <w:abstractNumId w:val="9"/>
+  </w:num>
+  <w:num w:numId="24" w16cid:durableId="332146001">
+    <w:abstractNumId w:val="12"/>
+    <w:lvlOverride w:ilvl="0">
+      <w:startOverride w:val="1"/>
+    </w:lvlOverride>
+    <w:lvlOverride w:ilvl="1">
+      <w:startOverride w:val="1"/>
+    </w:lvlOverride>
+    <w:lvlOverride w:ilvl="2">
+      <w:startOverride w:val="1"/>
+    </w:lvlOverride>
+    <w:lvlOverride w:ilvl="3">
+      <w:startOverride w:val="1"/>
+    </w:lvlOverride>
+    <w:lvlOverride w:ilvl="4">
+      <w:startOverride w:val="1"/>
+    </w:lvlOverride>
+    <w:lvlOverride w:ilvl="5">
+      <w:startOverride w:val="1"/>
+    </w:lvlOverride>
+    <w:lvlOverride w:ilvl="6">
+      <w:startOverride w:val="1"/>
+    </w:lvlOverride>
+    <w:lvlOverride w:ilvl="7">
+      <w:startOverride w:val="1"/>
+    </w:lvlOverride>
+    <w:lvlOverride w:ilvl="8">
+      <w:startOverride w:val="1"/>
+    </w:lvlOverride>
+  </w:num>
+  <w:num w:numId="25" w16cid:durableId="908879595">
     <w:abstractNumId w:val="0"/>
+  </w:num>
+  <w:num w:numId="26" w16cid:durableId="1922518449">
+    <w:abstractNumId w:val="18"/>
+  </w:num>
+  <w:num w:numId="27" w16cid:durableId="1018585753">
+    <w:abstractNumId w:val="1"/>
   </w:num>
 </w:numbering>
 </file>

</xml_diff>